<commit_message>
docs: align thesis with school templates
</commit_message>
<xml_diff>
--- a/docs/thesis/drafts/程浩然_基于LangGraph的多Agent协作框架在医疗审计场景的设计与实现.docx
+++ b/docs/thesis/drafts/程浩然_基于LangGraph的多Agent协作框架在医疗审计场景的设计与实现.docx
@@ -148,7 +148,7 @@
       <w:tblGrid>
         <w:gridCol w:w="1701"/>
         <w:gridCol w:w="1247"/>
-        <w:gridCol w:w="5670"/>
+        <w:gridCol w:w="6917"/>
       </w:tblGrid>
       <w:tr>
         <w:trPr>
@@ -156,7 +156,8 @@
         </w:trPr>
         <w:tc>
           <w:tcPr>
-            <w:tcW w:w="1701" w:type="dxa"/>
+            <w:gridSpan w:val="2"/>
+            <w:tcW w:w="2948" w:type="dxa"/>
             <w:tcMar>
               <w:top w:w="60" w:type="dxa"/>
               <w:left w:w="80" w:type="dxa"/>
@@ -196,7 +197,6 @@
         <w:tc>
           <w:tcPr>
             <w:tcW w:w="6917" w:type="dxa"/>
-            <w:gridSpan w:val="2"/>
             <w:tcMar>
               <w:top w:w="60" w:type="dxa"/>
               <w:left w:w="80" w:type="dxa"/>
@@ -297,7 +297,8 @@
         </w:trPr>
         <w:tc>
           <w:tcPr>
-            <w:tcW w:w="1701" w:type="dxa"/>
+            <w:gridSpan w:val="2"/>
+            <w:tcW w:w="2948" w:type="dxa"/>
             <w:tcMar>
               <w:top w:w="60" w:type="dxa"/>
               <w:left w:w="80" w:type="dxa"/>
@@ -337,7 +338,6 @@
         <w:tc>
           <w:tcPr>
             <w:tcW w:w="6917" w:type="dxa"/>
-            <w:gridSpan w:val="2"/>
             <w:tcMar>
               <w:top w:w="60" w:type="dxa"/>
               <w:left w:w="80" w:type="dxa"/>
@@ -369,7 +369,8 @@
         </w:trPr>
         <w:tc>
           <w:tcPr>
-            <w:tcW w:w="1701" w:type="dxa"/>
+            <w:gridSpan w:val="2"/>
+            <w:tcW w:w="2948" w:type="dxa"/>
             <w:tcMar>
               <w:top w:w="60" w:type="dxa"/>
               <w:left w:w="80" w:type="dxa"/>
@@ -409,7 +410,6 @@
         <w:tc>
           <w:tcPr>
             <w:tcW w:w="6917" w:type="dxa"/>
-            <w:gridSpan w:val="2"/>
             <w:tcMar>
               <w:top w:w="60" w:type="dxa"/>
               <w:left w:w="80" w:type="dxa"/>
@@ -441,7 +441,8 @@
         </w:trPr>
         <w:tc>
           <w:tcPr>
-            <w:tcW w:w="1701" w:type="dxa"/>
+            <w:gridSpan w:val="2"/>
+            <w:tcW w:w="2948" w:type="dxa"/>
             <w:tcMar>
               <w:top w:w="60" w:type="dxa"/>
               <w:left w:w="80" w:type="dxa"/>
@@ -467,7 +468,6 @@
         <w:tc>
           <w:tcPr>
             <w:tcW w:w="6917" w:type="dxa"/>
-            <w:gridSpan w:val="2"/>
             <w:tcMar>
               <w:top w:w="60" w:type="dxa"/>
               <w:left w:w="80" w:type="dxa"/>
@@ -499,7 +499,8 @@
         </w:trPr>
         <w:tc>
           <w:tcPr>
-            <w:tcW w:w="1701" w:type="dxa"/>
+            <w:gridSpan w:val="2"/>
+            <w:tcW w:w="2948" w:type="dxa"/>
             <w:tcMar>
               <w:top w:w="60" w:type="dxa"/>
               <w:left w:w="80" w:type="dxa"/>
@@ -539,7 +540,6 @@
         <w:tc>
           <w:tcPr>
             <w:tcW w:w="6917" w:type="dxa"/>
-            <w:gridSpan w:val="2"/>
             <w:tcMar>
               <w:top w:w="60" w:type="dxa"/>
               <w:left w:w="80" w:type="dxa"/>
@@ -629,7 +629,7 @@
         </w:tc>
         <w:tc>
           <w:tcPr>
-            <w:tcW w:w="5670" w:type="dxa"/>
+            <w:tcW w:w="6917" w:type="dxa"/>
             <w:tcMar>
               <w:top w:w="60" w:type="dxa"/>
               <w:left w:w="80" w:type="dxa"/>
@@ -661,7 +661,8 @@
         </w:trPr>
         <w:tc>
           <w:tcPr>
-            <w:tcW w:w="1701" w:type="dxa"/>
+            <w:gridSpan w:val="2"/>
+            <w:tcW w:w="2948" w:type="dxa"/>
             <w:tcMar>
               <w:top w:w="60" w:type="dxa"/>
               <w:left w:w="80" w:type="dxa"/>
@@ -687,7 +688,6 @@
         <w:tc>
           <w:tcPr>
             <w:tcW w:w="6917" w:type="dxa"/>
-            <w:gridSpan w:val="2"/>
             <w:tcMar>
               <w:top w:w="60" w:type="dxa"/>
               <w:left w:w="80" w:type="dxa"/>
@@ -775,6 +775,3056 @@
                 <w:sz w:val="28"/>
               </w:rPr>
               <w:t>日</w:t>
+            </w:r>
+          </w:p>
+        </w:tc>
+      </w:tr>
+    </w:tbl>
+    <w:p>
+      <w:r>
+        <w:br w:type="page"/>
+      </w:r>
+    </w:p>
+    <w:p>
+      <w:pPr>
+        <w:spacing w:before="240" w:after="240"/>
+        <w:rPr>
+          <w:rFonts w:ascii="Times New Roman"/>
+          <w:w w:val="90"/>
+        </w:rPr>
+        <w:jc w:val="center"/>
+      </w:pPr>
+      <w:r>
+        <w:rPr>
+          <w:rFonts w:ascii="宋体" w:eastAsia="宋体"/>
+          <w:b/>
+          <w:sz w:val="32"/>
+          <w:szCs w:val="32"/>
+        </w:rPr>
+        <w:t>毕业设计（论文）任务书</w:t>
+      </w:r>
+    </w:p>
+    <w:p>
+      <w:pPr>
+        <w:spacing w:line="360" w:lineRule="auto"/>
+        <w:ind w:firstLine="361" w:firstLineChars="150"/>
+        <w:jc w:val="left"/>
+        <w:rPr>
+          <w:rFonts w:ascii="Times New Roman"/>
+          <w:b/>
+          <w:bCs/>
+          <w:sz w:val="18"/>
+          <w:szCs w:val="18"/>
+        </w:rPr>
+      </w:pPr>
+      <w:r>
+        <w:rPr>
+          <w:rFonts w:ascii="Times New Roman"/>
+          <w:b/>
+          <w:bCs/>
+        </w:rPr>
+        <w:t>学院：计算机学院        专业：计算机科学与技术        班级：计科2401-本</w:t>
+      </w:r>
+    </w:p>
+    <w:tbl>
+      <w:tblPr>
+        <w:tblStyle w:val="14"/>
+        <w:tblW w:w="9101" w:type="dxa"/>
+        <w:jc w:val="center"/>
+        <w:tblBorders>
+          <w:top w:val="single" w:color="auto" w:sz="8" w:space="0"/>
+          <w:left w:val="single" w:color="auto" w:sz="8" w:space="0"/>
+          <w:bottom w:val="single" w:color="auto" w:sz="8" w:space="0"/>
+          <w:right w:val="single" w:color="auto" w:sz="8" w:space="0"/>
+          <w:insideH w:val="single" w:color="auto" w:sz="8" w:space="0"/>
+          <w:insideV w:val="single" w:color="auto" w:sz="8" w:space="0"/>
+        </w:tblBorders>
+        <w:tblLayout w:type="fixed"/>
+        <w:tblCellMar>
+          <w:top w:w="0" w:type="dxa"/>
+          <w:left w:w="108" w:type="dxa"/>
+          <w:bottom w:w="0" w:type="dxa"/>
+          <w:right w:w="108" w:type="dxa"/>
+        </w:tblCellMar>
+      </w:tblPr>
+      <w:tblGrid>
+        <w:gridCol w:w="1165"/>
+        <w:gridCol w:w="1382"/>
+        <w:gridCol w:w="1061"/>
+        <w:gridCol w:w="1036"/>
+        <w:gridCol w:w="489"/>
+        <w:gridCol w:w="733"/>
+        <w:gridCol w:w="1059"/>
+        <w:gridCol w:w="192"/>
+        <w:gridCol w:w="309"/>
+        <w:gridCol w:w="1675"/>
+      </w:tblGrid>
+      <w:tr>
+        <w:tblPrEx>
+          <w:tblBorders>
+            <w:top w:val="single" w:color="auto" w:sz="8" w:space="0"/>
+            <w:left w:val="single" w:color="auto" w:sz="8" w:space="0"/>
+            <w:bottom w:val="single" w:color="auto" w:sz="8" w:space="0"/>
+            <w:right w:val="single" w:color="auto" w:sz="8" w:space="0"/>
+            <w:insideH w:val="single" w:color="auto" w:sz="8" w:space="0"/>
+            <w:insideV w:val="single" w:color="auto" w:sz="8" w:space="0"/>
+          </w:tblBorders>
+          <w:tblCellMar>
+            <w:top w:w="0" w:type="dxa"/>
+            <w:left w:w="108" w:type="dxa"/>
+            <w:bottom w:w="0" w:type="dxa"/>
+            <w:right w:w="108" w:type="dxa"/>
+          </w:tblCellMar>
+        </w:tblPrEx>
+        <w:trPr>
+          <w:cantSplit/>
+          <w:trHeight w:val="524" w:hRule="atLeast"/>
+          <w:jc w:val="center"/>
+        </w:trPr>
+        <w:tc>
+          <w:tcPr>
+            <w:tcW w:w="2547" w:type="dxa"/>
+            <w:gridSpan w:val="2"/>
+            <w:tcBorders>
+              <w:top w:val="single" w:color="auto" w:sz="4" w:space="0"/>
+              <w:left w:val="single" w:color="auto" w:sz="4" w:space="0"/>
+              <w:bottom w:val="single" w:color="auto" w:sz="4" w:space="0"/>
+              <w:right w:val="single" w:color="auto" w:sz="4" w:space="0"/>
+            </w:tcBorders>
+            <w:vAlign w:val="center"/>
+          </w:tcPr>
+          <w:p>
+            <w:pPr>
+              <w:jc w:val="center"/>
+              <w:rPr>
+                <w:rFonts w:ascii="Times New Roman"/>
+                <w:b/>
+                <w:bCs/>
+              </w:rPr>
+            </w:pPr>
+            <w:r>
+              <w:rPr>
+                <w:rFonts w:ascii="Times New Roman"/>
+                <w:b/>
+                <w:bCs/>
+              </w:rPr>
+              <w:t>学生情况</w:t>
+            </w:r>
+          </w:p>
+        </w:tc>
+        <w:tc>
+          <w:tcPr>
+            <w:tcW w:w="3319" w:type="dxa"/>
+            <w:gridSpan w:val="4"/>
+            <w:tcBorders>
+              <w:top w:val="single" w:color="auto" w:sz="4" w:space="0"/>
+              <w:left w:val="single" w:color="auto" w:sz="4" w:space="0"/>
+              <w:bottom w:val="single" w:color="auto" w:sz="4" w:space="0"/>
+              <w:right w:val="single" w:color="auto" w:sz="4" w:space="0"/>
+            </w:tcBorders>
+            <w:vAlign w:val="center"/>
+          </w:tcPr>
+          <w:p>
+            <w:pPr>
+              <w:jc w:val="center"/>
+              <w:rPr>
+                <w:rFonts w:ascii="Times New Roman"/>
+                <w:b/>
+                <w:bCs/>
+              </w:rPr>
+            </w:pPr>
+            <w:r>
+              <w:rPr>
+                <w:rFonts w:ascii="Times New Roman"/>
+                <w:b/>
+                <w:bCs/>
+              </w:rPr>
+              <w:t>指导教师情况</w:t>
+            </w:r>
+          </w:p>
+        </w:tc>
+        <w:tc>
+          <w:tcPr>
+            <w:tcW w:w="3235" w:type="dxa"/>
+            <w:gridSpan w:val="4"/>
+            <w:tcBorders>
+              <w:top w:val="single" w:color="auto" w:sz="4" w:space="0"/>
+              <w:left w:val="single" w:color="auto" w:sz="4" w:space="0"/>
+              <w:bottom w:val="single" w:color="auto" w:sz="4" w:space="0"/>
+              <w:right w:val="single" w:color="auto" w:sz="4" w:space="0"/>
+            </w:tcBorders>
+            <w:vAlign w:val="center"/>
+          </w:tcPr>
+          <w:p>
+            <w:pPr>
+              <w:jc w:val="center"/>
+              <w:rPr>
+                <w:rFonts w:ascii="Times New Roman"/>
+                <w:b/>
+                <w:bCs/>
+              </w:rPr>
+            </w:pPr>
+            <w:r>
+              <w:rPr>
+                <w:rFonts w:ascii="Times New Roman"/>
+                <w:b/>
+                <w:bCs/>
+              </w:rPr>
+              <w:t>题目类型</w:t>
+            </w:r>
+          </w:p>
+        </w:tc>
+      </w:tr>
+      <w:tr>
+        <w:tblPrEx>
+          <w:tblBorders>
+            <w:top w:val="single" w:color="auto" w:sz="8" w:space="0"/>
+            <w:left w:val="single" w:color="auto" w:sz="8" w:space="0"/>
+            <w:bottom w:val="single" w:color="auto" w:sz="8" w:space="0"/>
+            <w:right w:val="single" w:color="auto" w:sz="8" w:space="0"/>
+            <w:insideH w:val="single" w:color="auto" w:sz="8" w:space="0"/>
+            <w:insideV w:val="single" w:color="auto" w:sz="8" w:space="0"/>
+          </w:tblBorders>
+          <w:tblCellMar>
+            <w:top w:w="0" w:type="dxa"/>
+            <w:left w:w="108" w:type="dxa"/>
+            <w:bottom w:w="0" w:type="dxa"/>
+            <w:right w:w="108" w:type="dxa"/>
+          </w:tblCellMar>
+        </w:tblPrEx>
+        <w:trPr>
+          <w:cantSplit/>
+          <w:trHeight w:val="195" w:hRule="atLeast"/>
+          <w:jc w:val="center"/>
+        </w:trPr>
+        <w:tc>
+          <w:tcPr>
+            <w:tcW w:w="1165" w:type="dxa"/>
+            <w:vMerge w:val="restart"/>
+            <w:tcBorders>
+              <w:top w:val="single" w:color="auto" w:sz="4" w:space="0"/>
+              <w:left w:val="single" w:color="auto" w:sz="4" w:space="0"/>
+              <w:bottom w:val="single" w:color="auto" w:sz="4" w:space="0"/>
+              <w:right w:val="single" w:color="auto" w:sz="4" w:space="0"/>
+            </w:tcBorders>
+            <w:vAlign w:val="center"/>
+          </w:tcPr>
+          <w:p>
+            <w:pPr>
+              <w:jc w:val="center"/>
+              <w:rPr>
+                <w:rFonts w:ascii="Times New Roman"/>
+                <w:b/>
+                <w:bCs/>
+                <w:sz w:val="21"/>
+              </w:rPr>
+            </w:pPr>
+            <w:r>
+              <w:rPr>
+                <w:rFonts w:ascii="Times New Roman"/>
+                <w:b/>
+                <w:bCs/>
+                <w:sz w:val="21"/>
+              </w:rPr>
+              <w:t>姓 名</w:t>
+            </w:r>
+          </w:p>
+        </w:tc>
+        <w:tc>
+          <w:tcPr>
+            <w:tcW w:w="1382" w:type="dxa"/>
+            <w:vMerge w:val="restart"/>
+            <w:tcBorders>
+              <w:top w:val="single" w:color="auto" w:sz="4" w:space="0"/>
+              <w:left w:val="single" w:color="auto" w:sz="4" w:space="0"/>
+              <w:bottom w:val="single" w:color="auto" w:sz="4" w:space="0"/>
+              <w:right w:val="single" w:color="auto" w:sz="4" w:space="0"/>
+            </w:tcBorders>
+            <w:vAlign w:val="center"/>
+          </w:tcPr>
+          <w:p>
+            <w:pPr>
+              <w:jc w:val="center"/>
+              <w:rPr>
+                <w:rFonts w:ascii="Times New Roman"/>
+                <w:b/>
+                <w:bCs/>
+                <w:sz w:val="21"/>
+              </w:rPr>
+            </w:pPr>
+            <w:r>
+              <w:rPr>
+                <w:rFonts w:ascii="Times New Roman"/>
+                <w:b/>
+                <w:bCs/>
+                <w:sz w:val="21"/>
+              </w:rPr>
+              <w:t>学 号</w:t>
+            </w:r>
+          </w:p>
+        </w:tc>
+        <w:tc>
+          <w:tcPr>
+            <w:tcW w:w="1061" w:type="dxa"/>
+            <w:vMerge w:val="restart"/>
+            <w:tcBorders>
+              <w:top w:val="single" w:color="auto" w:sz="4" w:space="0"/>
+              <w:left w:val="single" w:color="auto" w:sz="4" w:space="0"/>
+              <w:bottom w:val="single" w:color="auto" w:sz="4" w:space="0"/>
+              <w:right w:val="single" w:color="auto" w:sz="4" w:space="0"/>
+            </w:tcBorders>
+            <w:vAlign w:val="center"/>
+          </w:tcPr>
+          <w:p>
+            <w:pPr>
+              <w:jc w:val="center"/>
+              <w:rPr>
+                <w:rFonts w:ascii="Times New Roman"/>
+                <w:b/>
+                <w:bCs/>
+                <w:sz w:val="21"/>
+              </w:rPr>
+            </w:pPr>
+            <w:r>
+              <w:rPr>
+                <w:rFonts w:ascii="Times New Roman"/>
+                <w:b/>
+                <w:bCs/>
+                <w:sz w:val="21"/>
+              </w:rPr>
+              <w:t>姓 名</w:t>
+            </w:r>
+          </w:p>
+        </w:tc>
+        <w:tc>
+          <w:tcPr>
+            <w:tcW w:w="1036" w:type="dxa"/>
+            <w:vMerge w:val="restart"/>
+            <w:tcBorders>
+              <w:top w:val="single" w:color="auto" w:sz="4" w:space="0"/>
+              <w:left w:val="single" w:color="auto" w:sz="4" w:space="0"/>
+              <w:bottom w:val="single" w:color="auto" w:sz="4" w:space="0"/>
+              <w:right w:val="single" w:color="auto" w:sz="4" w:space="0"/>
+            </w:tcBorders>
+            <w:vAlign w:val="center"/>
+          </w:tcPr>
+          <w:p>
+            <w:pPr>
+              <w:jc w:val="center"/>
+              <w:rPr>
+                <w:rFonts w:ascii="Times New Roman"/>
+                <w:b/>
+                <w:bCs/>
+                <w:sz w:val="21"/>
+              </w:rPr>
+            </w:pPr>
+            <w:r>
+              <w:rPr>
+                <w:rFonts w:ascii="Times New Roman"/>
+                <w:b/>
+                <w:bCs/>
+                <w:sz w:val="21"/>
+              </w:rPr>
+              <w:t>职  称</w:t>
+            </w:r>
+          </w:p>
+        </w:tc>
+        <w:tc>
+          <w:tcPr>
+            <w:tcW w:w="1222" w:type="dxa"/>
+            <w:gridSpan w:val="2"/>
+            <w:vMerge w:val="restart"/>
+            <w:tcBorders>
+              <w:top w:val="single" w:color="auto" w:sz="4" w:space="0"/>
+              <w:left w:val="single" w:color="auto" w:sz="4" w:space="0"/>
+              <w:bottom w:val="single" w:color="auto" w:sz="4" w:space="0"/>
+              <w:right w:val="single" w:color="auto" w:sz="4" w:space="0"/>
+            </w:tcBorders>
+            <w:vAlign w:val="center"/>
+          </w:tcPr>
+          <w:p>
+            <w:pPr>
+              <w:jc w:val="center"/>
+              <w:rPr>
+                <w:rFonts w:ascii="Times New Roman"/>
+                <w:b/>
+                <w:bCs/>
+                <w:sz w:val="21"/>
+              </w:rPr>
+            </w:pPr>
+            <w:r>
+              <w:rPr>
+                <w:rFonts w:ascii="Times New Roman"/>
+                <w:b/>
+                <w:bCs/>
+                <w:sz w:val="21"/>
+              </w:rPr>
+              <w:t>单   位</w:t>
+            </w:r>
+          </w:p>
+        </w:tc>
+        <w:tc>
+          <w:tcPr>
+            <w:tcW w:w="1560" w:type="dxa"/>
+            <w:gridSpan w:val="3"/>
+            <w:tcBorders>
+              <w:top w:val="single" w:color="auto" w:sz="4" w:space="0"/>
+              <w:left w:val="single" w:color="auto" w:sz="4" w:space="0"/>
+              <w:bottom w:val="single" w:color="auto" w:sz="4" w:space="0"/>
+              <w:right w:val="single" w:color="auto" w:sz="4" w:space="0"/>
+            </w:tcBorders>
+            <w:vAlign w:val="center"/>
+          </w:tcPr>
+          <w:p>
+            <w:pPr>
+              <w:jc w:val="center"/>
+              <w:rPr>
+                <w:rFonts w:ascii="Times New Roman"/>
+                <w:b/>
+                <w:bCs/>
+                <w:w w:val="90"/>
+                <w:sz w:val="21"/>
+              </w:rPr>
+            </w:pPr>
+            <w:r>
+              <w:rPr>
+                <w:rFonts w:ascii="Times New Roman"/>
+                <w:b/>
+                <w:bCs/>
+                <w:w w:val="90"/>
+                <w:sz w:val="21"/>
+              </w:rPr>
+              <w:t>理工专业</w:t>
+            </w:r>
+          </w:p>
+        </w:tc>
+        <w:tc>
+          <w:tcPr>
+            <w:tcW w:w="1675" w:type="dxa"/>
+            <w:tcBorders>
+              <w:top w:val="single" w:color="auto" w:sz="4" w:space="0"/>
+              <w:left w:val="single" w:color="auto" w:sz="4" w:space="0"/>
+              <w:bottom w:val="single" w:color="auto" w:sz="4" w:space="0"/>
+              <w:right w:val="single" w:color="auto" w:sz="4" w:space="0"/>
+            </w:tcBorders>
+            <w:vAlign w:val="center"/>
+          </w:tcPr>
+          <w:p>
+            <w:pPr>
+              <w:rPr>
+                <w:rFonts w:ascii="Times New Roman"/>
+                <w:b/>
+                <w:bCs/>
+                <w:w w:val="90"/>
+                <w:sz w:val="21"/>
+              </w:rPr>
+            </w:pPr>
+            <w:r>
+              <w:rPr>
+                <w:rFonts w:ascii="Times New Roman"/>
+                <w:b/>
+                <w:bCs/>
+                <w:w w:val="90"/>
+                <w:sz w:val="21"/>
+              </w:rPr>
+              <w:t>文、管、经专业</w:t>
+            </w:r>
+          </w:p>
+        </w:tc>
+      </w:tr>
+      <w:tr>
+        <w:tblPrEx>
+          <w:tblBorders>
+            <w:top w:val="single" w:color="auto" w:sz="8" w:space="0"/>
+            <w:left w:val="single" w:color="auto" w:sz="8" w:space="0"/>
+            <w:bottom w:val="single" w:color="auto" w:sz="8" w:space="0"/>
+            <w:right w:val="single" w:color="auto" w:sz="8" w:space="0"/>
+            <w:insideH w:val="single" w:color="auto" w:sz="8" w:space="0"/>
+            <w:insideV w:val="single" w:color="auto" w:sz="8" w:space="0"/>
+          </w:tblBorders>
+          <w:tblCellMar>
+            <w:top w:w="0" w:type="dxa"/>
+            <w:left w:w="108" w:type="dxa"/>
+            <w:bottom w:w="0" w:type="dxa"/>
+            <w:right w:w="108" w:type="dxa"/>
+          </w:tblCellMar>
+        </w:tblPrEx>
+        <w:trPr>
+          <w:cantSplit/>
+          <w:trHeight w:val="259" w:hRule="atLeast"/>
+          <w:jc w:val="center"/>
+        </w:trPr>
+        <w:tc>
+          <w:tcPr>
+            <w:tcW w:w="1165" w:type="dxa"/>
+            <w:vMerge w:val="continue"/>
+            <w:tcBorders>
+              <w:top w:val="single" w:color="auto" w:sz="4" w:space="0"/>
+              <w:left w:val="single" w:color="auto" w:sz="4" w:space="0"/>
+              <w:bottom w:val="single" w:color="auto" w:sz="4" w:space="0"/>
+              <w:right w:val="single" w:color="auto" w:sz="4" w:space="0"/>
+            </w:tcBorders>
+            <w:vAlign w:val="center"/>
+          </w:tcPr>
+          <w:p>
+            <w:pPr>
+              <w:spacing w:before="0" w:after="0" w:line="260" w:lineRule="auto"/>
+            </w:pPr>
+            <w:r>
+              <w:rPr>
+                <w:rFonts w:ascii="宋体" w:eastAsia="宋体"/>
+                <w:sz w:val="20"/>
+                <w:szCs w:val="20"/>
+              </w:rPr>
+              <w:t/>
+            </w:r>
+          </w:p>
+        </w:tc>
+        <w:tc>
+          <w:tcPr>
+            <w:tcW w:w="1382" w:type="dxa"/>
+            <w:vMerge w:val="continue"/>
+            <w:tcBorders>
+              <w:top w:val="single" w:color="auto" w:sz="4" w:space="0"/>
+              <w:left w:val="single" w:color="auto" w:sz="4" w:space="0"/>
+              <w:bottom w:val="single" w:color="auto" w:sz="4" w:space="0"/>
+              <w:right w:val="single" w:color="auto" w:sz="4" w:space="0"/>
+            </w:tcBorders>
+            <w:vAlign w:val="center"/>
+          </w:tcPr>
+          <w:p>
+            <w:pPr>
+              <w:spacing w:before="0" w:after="0" w:line="260" w:lineRule="auto"/>
+            </w:pPr>
+            <w:r>
+              <w:rPr>
+                <w:rFonts w:ascii="宋体" w:eastAsia="宋体"/>
+                <w:sz w:val="20"/>
+                <w:szCs w:val="20"/>
+              </w:rPr>
+              <w:t/>
+            </w:r>
+          </w:p>
+        </w:tc>
+        <w:tc>
+          <w:tcPr>
+            <w:tcW w:w="1061" w:type="dxa"/>
+            <w:vMerge w:val="continue"/>
+            <w:tcBorders>
+              <w:top w:val="single" w:color="auto" w:sz="4" w:space="0"/>
+              <w:left w:val="single" w:color="auto" w:sz="4" w:space="0"/>
+              <w:bottom w:val="single" w:color="auto" w:sz="4" w:space="0"/>
+              <w:right w:val="single" w:color="auto" w:sz="4" w:space="0"/>
+            </w:tcBorders>
+            <w:vAlign w:val="center"/>
+          </w:tcPr>
+          <w:p>
+            <w:pPr>
+              <w:spacing w:before="0" w:after="0" w:line="260" w:lineRule="auto"/>
+            </w:pPr>
+            <w:r>
+              <w:rPr>
+                <w:rFonts w:ascii="宋体" w:eastAsia="宋体"/>
+                <w:sz w:val="20"/>
+                <w:szCs w:val="20"/>
+              </w:rPr>
+              <w:t/>
+            </w:r>
+          </w:p>
+        </w:tc>
+        <w:tc>
+          <w:tcPr>
+            <w:tcW w:w="1036" w:type="dxa"/>
+            <w:vMerge w:val="continue"/>
+            <w:tcBorders>
+              <w:top w:val="single" w:color="auto" w:sz="4" w:space="0"/>
+              <w:left w:val="single" w:color="auto" w:sz="4" w:space="0"/>
+              <w:bottom w:val="single" w:color="auto" w:sz="4" w:space="0"/>
+              <w:right w:val="single" w:color="auto" w:sz="4" w:space="0"/>
+            </w:tcBorders>
+            <w:vAlign w:val="center"/>
+          </w:tcPr>
+          <w:p>
+            <w:pPr>
+              <w:spacing w:before="0" w:after="0" w:line="260" w:lineRule="auto"/>
+            </w:pPr>
+            <w:r>
+              <w:rPr>
+                <w:rFonts w:ascii="宋体" w:eastAsia="宋体"/>
+                <w:sz w:val="20"/>
+                <w:szCs w:val="20"/>
+              </w:rPr>
+              <w:t/>
+            </w:r>
+          </w:p>
+        </w:tc>
+        <w:tc>
+          <w:tcPr>
+            <w:tcW w:w="1222" w:type="dxa"/>
+            <w:gridSpan w:val="2"/>
+            <w:vMerge w:val="continue"/>
+            <w:tcBorders>
+              <w:top w:val="single" w:color="auto" w:sz="4" w:space="0"/>
+              <w:left w:val="single" w:color="auto" w:sz="4" w:space="0"/>
+              <w:bottom w:val="single" w:color="auto" w:sz="4" w:space="0"/>
+              <w:right w:val="single" w:color="auto" w:sz="4" w:space="0"/>
+            </w:tcBorders>
+            <w:vAlign w:val="center"/>
+          </w:tcPr>
+          <w:p>
+            <w:pPr>
+              <w:spacing w:before="0" w:after="0" w:line="260" w:lineRule="auto"/>
+            </w:pPr>
+            <w:r>
+              <w:rPr>
+                <w:rFonts w:ascii="宋体" w:eastAsia="宋体"/>
+                <w:sz w:val="20"/>
+                <w:szCs w:val="20"/>
+              </w:rPr>
+              <w:t/>
+            </w:r>
+          </w:p>
+        </w:tc>
+        <w:tc>
+          <w:tcPr>
+            <w:tcW w:w="1560" w:type="dxa"/>
+            <w:gridSpan w:val="3"/>
+            <w:tcBorders>
+              <w:top w:val="single" w:color="auto" w:sz="4" w:space="0"/>
+              <w:left w:val="single" w:color="auto" w:sz="4" w:space="0"/>
+              <w:bottom w:val="single" w:color="auto" w:sz="4" w:space="0"/>
+              <w:right w:val="single" w:color="auto" w:sz="4" w:space="0"/>
+            </w:tcBorders>
+            <w:vAlign w:val="center"/>
+          </w:tcPr>
+          <w:p>
+            <w:pPr>
+              <w:spacing w:before="0" w:after="0" w:line="260" w:lineRule="auto"/>
+            </w:pPr>
+            <w:r>
+              <w:rPr>
+                <w:rFonts w:ascii="宋体" w:eastAsia="宋体"/>
+                <w:sz w:val="20"/>
+                <w:szCs w:val="20"/>
+              </w:rPr>
+              <w:t>理论研究     □</w:t>
+            </w:r>
+          </w:p>
+        </w:tc>
+        <w:tc>
+          <w:tcPr>
+            <w:tcW w:w="1675" w:type="dxa"/>
+            <w:tcBorders>
+              <w:top w:val="single" w:color="auto" w:sz="4" w:space="0"/>
+              <w:left w:val="single" w:color="auto" w:sz="4" w:space="0"/>
+              <w:bottom w:val="single" w:color="auto" w:sz="4" w:space="0"/>
+              <w:right w:val="single" w:color="auto" w:sz="4" w:space="0"/>
+            </w:tcBorders>
+            <w:vAlign w:val="center"/>
+          </w:tcPr>
+          <w:p>
+            <w:pPr>
+              <w:spacing w:before="0" w:after="0" w:line="260" w:lineRule="auto"/>
+            </w:pPr>
+            <w:r>
+              <w:rPr>
+                <w:rFonts w:ascii="宋体" w:eastAsia="宋体"/>
+                <w:sz w:val="20"/>
+                <w:szCs w:val="20"/>
+              </w:rPr>
+              <w:t>理论研究     □</w:t>
+            </w:r>
+          </w:p>
+        </w:tc>
+      </w:tr>
+      <w:tr>
+        <w:tblPrEx>
+          <w:tblBorders>
+            <w:top w:val="single" w:color="auto" w:sz="8" w:space="0"/>
+            <w:left w:val="single" w:color="auto" w:sz="8" w:space="0"/>
+            <w:bottom w:val="single" w:color="auto" w:sz="8" w:space="0"/>
+            <w:right w:val="single" w:color="auto" w:sz="8" w:space="0"/>
+            <w:insideH w:val="single" w:color="auto" w:sz="8" w:space="0"/>
+            <w:insideV w:val="single" w:color="auto" w:sz="8" w:space="0"/>
+          </w:tblBorders>
+          <w:tblCellMar>
+            <w:top w:w="0" w:type="dxa"/>
+            <w:left w:w="108" w:type="dxa"/>
+            <w:bottom w:w="0" w:type="dxa"/>
+            <w:right w:w="108" w:type="dxa"/>
+          </w:tblCellMar>
+        </w:tblPrEx>
+        <w:trPr>
+          <w:cantSplit/>
+          <w:trHeight w:val="255" w:hRule="atLeast"/>
+          <w:jc w:val="center"/>
+        </w:trPr>
+        <w:tc>
+          <w:tcPr>
+            <w:tcW w:w="1165" w:type="dxa"/>
+            <w:vMerge w:val="restart"/>
+            <w:tcBorders>
+              <w:top w:val="single" w:color="auto" w:sz="4" w:space="0"/>
+              <w:left w:val="single" w:color="auto" w:sz="4" w:space="0"/>
+              <w:bottom w:val="single" w:color="auto" w:sz="4" w:space="0"/>
+              <w:right w:val="single" w:color="auto" w:sz="4" w:space="0"/>
+            </w:tcBorders>
+            <w:vAlign w:val="center"/>
+          </w:tcPr>
+          <w:p>
+            <w:pPr>
+              <w:spacing w:before="0" w:after="0" w:line="260" w:lineRule="auto"/>
+            </w:pPr>
+            <w:r>
+              <w:rPr>
+                <w:rFonts w:ascii="宋体" w:eastAsia="宋体"/>
+                <w:sz w:val="20"/>
+                <w:szCs w:val="20"/>
+              </w:rPr>
+              <w:t>程浩然</w:t>
+            </w:r>
+          </w:p>
+        </w:tc>
+        <w:tc>
+          <w:tcPr>
+            <w:tcW w:w="1382" w:type="dxa"/>
+            <w:vMerge w:val="restart"/>
+            <w:tcBorders>
+              <w:top w:val="single" w:color="auto" w:sz="4" w:space="0"/>
+              <w:left w:val="single" w:color="auto" w:sz="4" w:space="0"/>
+              <w:bottom w:val="single" w:color="auto" w:sz="4" w:space="0"/>
+              <w:right w:val="single" w:color="auto" w:sz="4" w:space="0"/>
+            </w:tcBorders>
+            <w:vAlign w:val="center"/>
+          </w:tcPr>
+          <w:p>
+            <w:pPr>
+              <w:spacing w:before="0" w:after="0" w:line="260" w:lineRule="auto"/>
+            </w:pPr>
+            <w:r>
+              <w:rPr>
+                <w:rFonts w:ascii="宋体" w:eastAsia="宋体"/>
+                <w:sz w:val="20"/>
+                <w:szCs w:val="20"/>
+              </w:rPr>
+              <w:t>2024070013</w:t>
+            </w:r>
+          </w:p>
+        </w:tc>
+        <w:tc>
+          <w:tcPr>
+            <w:tcW w:w="1061" w:type="dxa"/>
+            <w:vMerge w:val="restart"/>
+            <w:tcBorders>
+              <w:top w:val="single" w:color="auto" w:sz="4" w:space="0"/>
+              <w:left w:val="single" w:color="auto" w:sz="4" w:space="0"/>
+              <w:bottom w:val="single" w:color="auto" w:sz="4" w:space="0"/>
+              <w:right w:val="single" w:color="auto" w:sz="4" w:space="0"/>
+            </w:tcBorders>
+            <w:vAlign w:val="center"/>
+          </w:tcPr>
+          <w:p>
+            <w:pPr>
+              <w:spacing w:before="0" w:after="0" w:line="260" w:lineRule="auto"/>
+            </w:pPr>
+            <w:r>
+              <w:rPr>
+                <w:rFonts w:ascii="宋体" w:eastAsia="宋体"/>
+                <w:sz w:val="20"/>
+                <w:szCs w:val="20"/>
+              </w:rPr>
+              <w:t>乔文豹</w:t>
+            </w:r>
+          </w:p>
+        </w:tc>
+        <w:tc>
+          <w:tcPr>
+            <w:tcW w:w="1036" w:type="dxa"/>
+            <w:vMerge w:val="restart"/>
+            <w:tcBorders>
+              <w:top w:val="single" w:color="auto" w:sz="4" w:space="0"/>
+              <w:left w:val="single" w:color="auto" w:sz="4" w:space="0"/>
+              <w:bottom w:val="single" w:color="auto" w:sz="4" w:space="0"/>
+              <w:right w:val="single" w:color="auto" w:sz="4" w:space="0"/>
+            </w:tcBorders>
+            <w:vAlign w:val="center"/>
+          </w:tcPr>
+          <w:p>
+            <w:pPr>
+              <w:spacing w:before="0" w:after="0" w:line="260" w:lineRule="auto"/>
+            </w:pPr>
+            <w:r>
+              <w:rPr>
+                <w:rFonts w:ascii="宋体" w:eastAsia="宋体"/>
+                <w:sz w:val="20"/>
+                <w:szCs w:val="20"/>
+              </w:rPr>
+              <w:t/>
+            </w:r>
+          </w:p>
+        </w:tc>
+        <w:tc>
+          <w:tcPr>
+            <w:tcW w:w="1222" w:type="dxa"/>
+            <w:gridSpan w:val="2"/>
+            <w:vMerge w:val="restart"/>
+            <w:tcBorders>
+              <w:top w:val="single" w:color="auto" w:sz="4" w:space="0"/>
+              <w:left w:val="single" w:color="auto" w:sz="4" w:space="0"/>
+              <w:bottom w:val="single" w:color="auto" w:sz="4" w:space="0"/>
+              <w:right w:val="single" w:color="auto" w:sz="4" w:space="0"/>
+            </w:tcBorders>
+            <w:vAlign w:val="center"/>
+          </w:tcPr>
+          <w:p>
+            <w:pPr>
+              <w:spacing w:before="0" w:after="0" w:line="260" w:lineRule="auto"/>
+            </w:pPr>
+            <w:r>
+              <w:rPr>
+                <w:rFonts w:ascii="宋体" w:eastAsia="宋体"/>
+                <w:sz w:val="20"/>
+                <w:szCs w:val="20"/>
+              </w:rPr>
+              <w:t>计算机学院</w:t>
+            </w:r>
+          </w:p>
+        </w:tc>
+        <w:tc>
+          <w:tcPr>
+            <w:tcW w:w="1560" w:type="dxa"/>
+            <w:gridSpan w:val="3"/>
+            <w:tcBorders>
+              <w:top w:val="single" w:color="auto" w:sz="4" w:space="0"/>
+              <w:left w:val="single" w:color="auto" w:sz="4" w:space="0"/>
+              <w:bottom w:val="single" w:color="auto" w:sz="4" w:space="0"/>
+              <w:right w:val="single" w:color="auto" w:sz="4" w:space="0"/>
+            </w:tcBorders>
+            <w:vAlign w:val="center"/>
+          </w:tcPr>
+          <w:p>
+            <w:pPr>
+              <w:spacing w:before="0" w:after="0" w:line="260" w:lineRule="auto"/>
+            </w:pPr>
+            <w:r>
+              <w:rPr>
+                <w:rFonts w:ascii="宋体" w:eastAsia="宋体"/>
+                <w:sz w:val="20"/>
+                <w:szCs w:val="20"/>
+              </w:rPr>
+              <w:t>科研开发     □</w:t>
+            </w:r>
+          </w:p>
+        </w:tc>
+        <w:tc>
+          <w:tcPr>
+            <w:tcW w:w="1675" w:type="dxa"/>
+            <w:tcBorders>
+              <w:top w:val="single" w:color="auto" w:sz="4" w:space="0"/>
+              <w:left w:val="single" w:color="auto" w:sz="4" w:space="0"/>
+              <w:bottom w:val="single" w:color="auto" w:sz="4" w:space="0"/>
+              <w:right w:val="single" w:color="auto" w:sz="4" w:space="0"/>
+            </w:tcBorders>
+            <w:vAlign w:val="center"/>
+          </w:tcPr>
+          <w:p>
+            <w:pPr>
+              <w:spacing w:before="0" w:after="0" w:line="260" w:lineRule="auto"/>
+            </w:pPr>
+            <w:r>
+              <w:rPr>
+                <w:rFonts w:ascii="宋体" w:eastAsia="宋体"/>
+                <w:sz w:val="20"/>
+                <w:szCs w:val="20"/>
+              </w:rPr>
+              <w:t>应用研究     □</w:t>
+            </w:r>
+          </w:p>
+        </w:tc>
+      </w:tr>
+      <w:tr>
+        <w:tblPrEx>
+          <w:tblBorders>
+            <w:top w:val="single" w:color="auto" w:sz="8" w:space="0"/>
+            <w:left w:val="single" w:color="auto" w:sz="8" w:space="0"/>
+            <w:bottom w:val="single" w:color="auto" w:sz="8" w:space="0"/>
+            <w:right w:val="single" w:color="auto" w:sz="8" w:space="0"/>
+            <w:insideH w:val="single" w:color="auto" w:sz="8" w:space="0"/>
+            <w:insideV w:val="single" w:color="auto" w:sz="8" w:space="0"/>
+          </w:tblBorders>
+          <w:tblCellMar>
+            <w:top w:w="0" w:type="dxa"/>
+            <w:left w:w="108" w:type="dxa"/>
+            <w:bottom w:w="0" w:type="dxa"/>
+            <w:right w:w="108" w:type="dxa"/>
+          </w:tblCellMar>
+        </w:tblPrEx>
+        <w:trPr>
+          <w:cantSplit/>
+          <w:trHeight w:val="285" w:hRule="atLeast"/>
+          <w:jc w:val="center"/>
+        </w:trPr>
+        <w:tc>
+          <w:tcPr>
+            <w:tcW w:w="1165" w:type="dxa"/>
+            <w:vMerge w:val="continue"/>
+            <w:tcBorders>
+              <w:top w:val="single" w:color="auto" w:sz="4" w:space="0"/>
+              <w:left w:val="single" w:color="auto" w:sz="4" w:space="0"/>
+              <w:bottom w:val="single" w:color="auto" w:sz="4" w:space="0"/>
+              <w:right w:val="single" w:color="auto" w:sz="4" w:space="0"/>
+            </w:tcBorders>
+            <w:vAlign w:val="center"/>
+          </w:tcPr>
+          <w:p>
+            <w:pPr>
+              <w:jc w:val="center"/>
+              <w:rPr>
+                <w:rFonts w:ascii="Times New Roman"/>
+                <w:b/>
+                <w:bCs/>
+                <w:sz w:val="21"/>
+              </w:rPr>
+            </w:pPr>
+          </w:p>
+        </w:tc>
+        <w:tc>
+          <w:tcPr>
+            <w:tcW w:w="1382" w:type="dxa"/>
+            <w:vMerge w:val="continue"/>
+            <w:tcBorders>
+              <w:top w:val="single" w:color="auto" w:sz="4" w:space="0"/>
+              <w:left w:val="single" w:color="auto" w:sz="4" w:space="0"/>
+              <w:bottom w:val="single" w:color="auto" w:sz="4" w:space="0"/>
+              <w:right w:val="single" w:color="auto" w:sz="4" w:space="0"/>
+            </w:tcBorders>
+            <w:vAlign w:val="center"/>
+          </w:tcPr>
+          <w:p>
+            <w:pPr>
+              <w:jc w:val="center"/>
+              <w:rPr>
+                <w:rFonts w:ascii="Times New Roman"/>
+                <w:b/>
+                <w:bCs/>
+                <w:sz w:val="21"/>
+              </w:rPr>
+            </w:pPr>
+          </w:p>
+        </w:tc>
+        <w:tc>
+          <w:tcPr>
+            <w:tcW w:w="1061" w:type="dxa"/>
+            <w:vMerge w:val="continue"/>
+            <w:tcBorders>
+              <w:top w:val="single" w:color="auto" w:sz="4" w:space="0"/>
+              <w:left w:val="single" w:color="auto" w:sz="4" w:space="0"/>
+              <w:bottom w:val="single" w:color="auto" w:sz="4" w:space="0"/>
+              <w:right w:val="single" w:color="auto" w:sz="4" w:space="0"/>
+            </w:tcBorders>
+            <w:vAlign w:val="center"/>
+          </w:tcPr>
+          <w:p>
+            <w:pPr>
+              <w:jc w:val="center"/>
+              <w:rPr>
+                <w:rFonts w:ascii="Times New Roman"/>
+                <w:b/>
+                <w:bCs/>
+                <w:sz w:val="21"/>
+              </w:rPr>
+            </w:pPr>
+          </w:p>
+        </w:tc>
+        <w:tc>
+          <w:tcPr>
+            <w:tcW w:w="1036" w:type="dxa"/>
+            <w:vMerge w:val="continue"/>
+            <w:tcBorders>
+              <w:top w:val="single" w:color="auto" w:sz="4" w:space="0"/>
+              <w:left w:val="single" w:color="auto" w:sz="4" w:space="0"/>
+              <w:bottom w:val="single" w:color="auto" w:sz="4" w:space="0"/>
+              <w:right w:val="single" w:color="auto" w:sz="4" w:space="0"/>
+            </w:tcBorders>
+            <w:vAlign w:val="center"/>
+          </w:tcPr>
+          <w:p>
+            <w:pPr>
+              <w:jc w:val="center"/>
+              <w:rPr>
+                <w:rFonts w:ascii="Times New Roman"/>
+                <w:b/>
+                <w:bCs/>
+                <w:sz w:val="21"/>
+              </w:rPr>
+            </w:pPr>
+          </w:p>
+        </w:tc>
+        <w:tc>
+          <w:tcPr>
+            <w:tcW w:w="1222" w:type="dxa"/>
+            <w:gridSpan w:val="2"/>
+            <w:vMerge w:val="continue"/>
+            <w:tcBorders>
+              <w:top w:val="single" w:color="auto" w:sz="4" w:space="0"/>
+              <w:left w:val="single" w:color="auto" w:sz="4" w:space="0"/>
+              <w:bottom w:val="single" w:color="auto" w:sz="4" w:space="0"/>
+              <w:right w:val="single" w:color="auto" w:sz="4" w:space="0"/>
+            </w:tcBorders>
+            <w:vAlign w:val="center"/>
+          </w:tcPr>
+          <w:p>
+            <w:pPr>
+              <w:jc w:val="center"/>
+              <w:rPr>
+                <w:rFonts w:ascii="Times New Roman"/>
+                <w:b/>
+                <w:bCs/>
+                <w:sz w:val="21"/>
+              </w:rPr>
+            </w:pPr>
+          </w:p>
+        </w:tc>
+        <w:tc>
+          <w:tcPr>
+            <w:tcW w:w="1560" w:type="dxa"/>
+            <w:gridSpan w:val="3"/>
+            <w:tcBorders>
+              <w:top w:val="single" w:color="auto" w:sz="4" w:space="0"/>
+              <w:left w:val="single" w:color="auto" w:sz="4" w:space="0"/>
+              <w:bottom w:val="single" w:color="auto" w:sz="4" w:space="0"/>
+              <w:right w:val="single" w:color="auto" w:sz="4" w:space="0"/>
+            </w:tcBorders>
+            <w:vAlign w:val="center"/>
+          </w:tcPr>
+          <w:p>
+            <w:pPr>
+              <w:spacing w:before="0" w:after="0" w:line="260" w:lineRule="auto"/>
+            </w:pPr>
+            <w:r>
+              <w:rPr>
+                <w:rFonts w:ascii="宋体" w:eastAsia="宋体"/>
+                <w:sz w:val="20"/>
+                <w:szCs w:val="20"/>
+              </w:rPr>
+              <w:t>工程设计     ■</w:t>
+            </w:r>
+          </w:p>
+        </w:tc>
+        <w:tc>
+          <w:tcPr>
+            <w:tcW w:w="1675" w:type="dxa"/>
+            <w:tcBorders>
+              <w:top w:val="single" w:color="auto" w:sz="4" w:space="0"/>
+              <w:left w:val="single" w:color="auto" w:sz="4" w:space="0"/>
+              <w:bottom w:val="single" w:color="auto" w:sz="4" w:space="0"/>
+              <w:right w:val="single" w:color="auto" w:sz="4" w:space="0"/>
+            </w:tcBorders>
+            <w:vAlign w:val="center"/>
+          </w:tcPr>
+          <w:p>
+            <w:pPr>
+              <w:spacing w:before="0" w:after="0" w:line="260" w:lineRule="auto"/>
+            </w:pPr>
+            <w:r>
+              <w:rPr>
+                <w:rFonts w:ascii="宋体" w:eastAsia="宋体"/>
+                <w:sz w:val="20"/>
+                <w:szCs w:val="20"/>
+              </w:rPr>
+              <w:t>调查研究     □</w:t>
+            </w:r>
+          </w:p>
+        </w:tc>
+      </w:tr>
+      <w:tr>
+        <w:tblPrEx>
+          <w:tblBorders>
+            <w:top w:val="single" w:color="auto" w:sz="8" w:space="0"/>
+            <w:left w:val="single" w:color="auto" w:sz="8" w:space="0"/>
+            <w:bottom w:val="single" w:color="auto" w:sz="8" w:space="0"/>
+            <w:right w:val="single" w:color="auto" w:sz="8" w:space="0"/>
+            <w:insideH w:val="single" w:color="auto" w:sz="8" w:space="0"/>
+            <w:insideV w:val="single" w:color="auto" w:sz="8" w:space="0"/>
+          </w:tblBorders>
+          <w:tblCellMar>
+            <w:top w:w="0" w:type="dxa"/>
+            <w:left w:w="108" w:type="dxa"/>
+            <w:bottom w:w="0" w:type="dxa"/>
+            <w:right w:w="108" w:type="dxa"/>
+          </w:tblCellMar>
+        </w:tblPrEx>
+        <w:trPr>
+          <w:cantSplit/>
+          <w:trHeight w:val="654" w:hRule="atLeast"/>
+          <w:jc w:val="center"/>
+        </w:trPr>
+        <w:tc>
+          <w:tcPr>
+            <w:tcW w:w="1165" w:type="dxa"/>
+            <w:tcBorders>
+              <w:top w:val="single" w:color="auto" w:sz="4" w:space="0"/>
+              <w:left w:val="single" w:color="auto" w:sz="4" w:space="0"/>
+              <w:bottom w:val="single" w:color="auto" w:sz="4" w:space="0"/>
+              <w:right w:val="single" w:color="auto" w:sz="4" w:space="0"/>
+            </w:tcBorders>
+            <w:vAlign w:val="center"/>
+          </w:tcPr>
+          <w:p>
+            <w:pPr>
+              <w:jc w:val="center"/>
+              <w:rPr>
+                <w:rFonts w:ascii="Times New Roman" w:eastAsia="汉仪书宋一简"/>
+                <w:b/>
+                <w:bCs/>
+                <w:sz w:val="21"/>
+              </w:rPr>
+            </w:pPr>
+            <w:r>
+              <w:rPr>
+                <w:rFonts w:ascii="Times New Roman" w:eastAsia="汉仪书宋一简"/>
+                <w:b/>
+                <w:bCs/>
+                <w:sz w:val="21"/>
+              </w:rPr>
+              <w:t>题目</w:t>
+            </w:r>
+          </w:p>
+        </w:tc>
+        <w:tc>
+          <w:tcPr>
+            <w:tcW w:w="3968" w:type="dxa"/>
+            <w:gridSpan w:val="4"/>
+            <w:tcBorders>
+              <w:top w:val="single" w:color="auto" w:sz="4" w:space="0"/>
+              <w:left w:val="single" w:color="auto" w:sz="4" w:space="0"/>
+              <w:bottom w:val="single" w:color="auto" w:sz="4" w:space="0"/>
+              <w:right w:val="single" w:color="auto" w:sz="4" w:space="0"/>
+            </w:tcBorders>
+            <w:vAlign w:val="center"/>
+          </w:tcPr>
+          <w:p>
+            <w:pPr>
+              <w:spacing w:before="0" w:after="0" w:line="260" w:lineRule="auto"/>
+            </w:pPr>
+            <w:r>
+              <w:rPr>
+                <w:rFonts w:ascii="宋体" w:eastAsia="宋体"/>
+                <w:sz w:val="20"/>
+                <w:szCs w:val="20"/>
+              </w:rPr>
+              <w:t>基于 LangGraph 的多 Agent 协作框架在医疗审计场景的设计与实现</w:t>
+            </w:r>
+          </w:p>
+        </w:tc>
+        <w:tc>
+          <w:tcPr>
+            <w:tcW w:w="1984" w:type="dxa"/>
+            <w:gridSpan w:val="3"/>
+            <w:tcBorders>
+              <w:top w:val="single" w:color="auto" w:sz="4" w:space="0"/>
+              <w:left w:val="single" w:color="auto" w:sz="4" w:space="0"/>
+              <w:bottom w:val="single" w:color="auto" w:sz="4" w:space="0"/>
+              <w:right w:val="single" w:color="auto" w:sz="4" w:space="0"/>
+            </w:tcBorders>
+            <w:vAlign w:val="center"/>
+          </w:tcPr>
+          <w:p>
+            <w:pPr>
+              <w:jc w:val="center"/>
+              <w:rPr>
+                <w:rFonts w:ascii="Times New Roman" w:eastAsia="汉仪书宋一简"/>
+                <w:b/>
+                <w:bCs/>
+                <w:sz w:val="21"/>
+              </w:rPr>
+            </w:pPr>
+            <w:r>
+              <w:rPr>
+                <w:rFonts w:ascii="Times New Roman" w:eastAsia="汉仪书宋一简"/>
+                <w:b/>
+                <w:bCs/>
+                <w:sz w:val="21"/>
+              </w:rPr>
+              <w:t>是否实物型毕设</w:t>
+            </w:r>
+          </w:p>
+        </w:tc>
+        <w:tc>
+          <w:tcPr>
+            <w:tcW w:w="1984" w:type="dxa"/>
+            <w:gridSpan w:val="2"/>
+            <w:tcBorders>
+              <w:top w:val="single" w:color="auto" w:sz="4" w:space="0"/>
+              <w:left w:val="single" w:color="auto" w:sz="4" w:space="0"/>
+              <w:bottom w:val="single" w:color="auto" w:sz="4" w:space="0"/>
+              <w:right w:val="single" w:color="auto" w:sz="4" w:space="0"/>
+            </w:tcBorders>
+            <w:vAlign w:val="center"/>
+          </w:tcPr>
+          <w:p>
+            <w:pPr>
+              <w:spacing w:before="0" w:after="0" w:line="260" w:lineRule="auto"/>
+            </w:pPr>
+            <w:r>
+              <w:rPr>
+                <w:rFonts w:ascii="宋体" w:eastAsia="宋体"/>
+                <w:sz w:val="20"/>
+                <w:szCs w:val="20"/>
+              </w:rPr>
+              <w:t>是■     否□</w:t>
+            </w:r>
+          </w:p>
+        </w:tc>
+      </w:tr>
+      <w:tr>
+        <w:tblPrEx>
+          <w:tblBorders>
+            <w:top w:val="single" w:color="auto" w:sz="8" w:space="0"/>
+            <w:left w:val="single" w:color="auto" w:sz="8" w:space="0"/>
+            <w:bottom w:val="single" w:color="auto" w:sz="8" w:space="0"/>
+            <w:right w:val="single" w:color="auto" w:sz="8" w:space="0"/>
+            <w:insideH w:val="single" w:color="auto" w:sz="8" w:space="0"/>
+            <w:insideV w:val="single" w:color="auto" w:sz="8" w:space="0"/>
+          </w:tblBorders>
+          <w:tblCellMar>
+            <w:top w:w="0" w:type="dxa"/>
+            <w:left w:w="108" w:type="dxa"/>
+            <w:bottom w:w="0" w:type="dxa"/>
+            <w:right w:w="108" w:type="dxa"/>
+          </w:tblCellMar>
+        </w:tblPrEx>
+        <w:trPr>
+          <w:cantSplit/>
+          <w:trHeight w:val="2514" w:hRule="atLeast"/>
+          <w:jc w:val="center"/>
+        </w:trPr>
+        <w:tc>
+          <w:tcPr>
+            <w:tcW w:w="1165" w:type="dxa"/>
+            <w:tcBorders>
+              <w:top w:val="single" w:color="auto" w:sz="4" w:space="0"/>
+              <w:left w:val="single" w:color="auto" w:sz="4" w:space="0"/>
+              <w:bottom w:val="single" w:color="auto" w:sz="4" w:space="0"/>
+              <w:right w:val="single" w:color="auto" w:sz="4" w:space="0"/>
+            </w:tcBorders>
+            <w:vAlign w:val="center"/>
+          </w:tcPr>
+          <w:p>
+            <w:pPr>
+              <w:jc w:val="center"/>
+              <w:rPr>
+                <w:rFonts w:ascii="Times New Roman" w:eastAsia="汉仪书宋一简"/>
+                <w:b/>
+                <w:bCs/>
+                <w:sz w:val="21"/>
+              </w:rPr>
+            </w:pPr>
+            <w:r>
+              <w:rPr>
+                <w:rFonts w:ascii="Times New Roman" w:eastAsia="汉仪书宋一简"/>
+                <w:b/>
+                <w:bCs/>
+                <w:sz w:val="21"/>
+              </w:rPr>
+              <w:t>主要</w:t>
+            </w:r>
+          </w:p>
+          <w:p>
+            <w:pPr>
+              <w:jc w:val="center"/>
+              <w:rPr>
+                <w:rFonts w:ascii="Times New Roman" w:eastAsia="汉仪书宋一简"/>
+                <w:b/>
+                <w:bCs/>
+                <w:sz w:val="21"/>
+              </w:rPr>
+            </w:pPr>
+            <w:r>
+              <w:rPr>
+                <w:rFonts w:ascii="Times New Roman" w:eastAsia="汉仪书宋一简"/>
+                <w:b/>
+                <w:bCs/>
+                <w:sz w:val="21"/>
+              </w:rPr>
+              <w:t>内容</w:t>
+            </w:r>
+          </w:p>
+          <w:p>
+            <w:pPr>
+              <w:jc w:val="center"/>
+              <w:rPr>
+                <w:rFonts w:ascii="Times New Roman" w:eastAsia="汉仪书宋一简"/>
+                <w:b/>
+                <w:bCs/>
+                <w:sz w:val="21"/>
+              </w:rPr>
+            </w:pPr>
+            <w:r>
+              <w:rPr>
+                <w:rFonts w:ascii="Times New Roman" w:eastAsia="汉仪书宋一简"/>
+                <w:b/>
+                <w:bCs/>
+                <w:sz w:val="21"/>
+              </w:rPr>
+              <w:t>以及</w:t>
+            </w:r>
+          </w:p>
+          <w:p>
+            <w:pPr>
+              <w:jc w:val="center"/>
+              <w:rPr>
+                <w:rFonts w:ascii="Times New Roman" w:eastAsia="汉仪书宋一简"/>
+                <w:b/>
+                <w:bCs/>
+                <w:sz w:val="21"/>
+              </w:rPr>
+            </w:pPr>
+            <w:r>
+              <w:rPr>
+                <w:rFonts w:ascii="Times New Roman" w:eastAsia="汉仪书宋一简"/>
+                <w:b/>
+                <w:bCs/>
+                <w:sz w:val="21"/>
+              </w:rPr>
+              <w:t>目标</w:t>
+            </w:r>
+          </w:p>
+        </w:tc>
+        <w:tc>
+          <w:tcPr>
+            <w:tcW w:w="7936" w:type="dxa"/>
+            <w:gridSpan w:val="9"/>
+            <w:tcBorders>
+              <w:top w:val="single" w:color="auto" w:sz="4" w:space="0"/>
+              <w:left w:val="single" w:color="auto" w:sz="4" w:space="0"/>
+              <w:bottom w:val="single" w:color="auto" w:sz="4" w:space="0"/>
+              <w:right w:val="single" w:color="auto" w:sz="4" w:space="0"/>
+            </w:tcBorders>
+          </w:tcPr>
+          <w:p>
+            <w:pPr>
+              <w:spacing w:before="0" w:after="0" w:line="260" w:lineRule="auto"/>
+            </w:pPr>
+            <w:r>
+              <w:rPr>
+                <w:rFonts w:ascii="宋体" w:eastAsia="宋体"/>
+                <w:sz w:val="20"/>
+                <w:szCs w:val="20"/>
+              </w:rPr>
+              <w:t>本毕业设计面向个人体检报告、检验单、病历摘要等医疗资料管理与审计辅助场景，完成一套基于 LangGraph 的多 Agent 协作框架原型系统。主要内容包括：1. 完成用户认证、资料上传、OCR 识别、标准化入库、文档版本和结构化指标的数据链路；2. 建立原始文件、OCR 结果、文档版本、指标、任务事件、Provider 调用事件和审计事件等数据模型；3. 基于 LangGraph 设计综合审计报告状态机，将文档质量、时间线、指标一致性、风险提示、知识检索、证据绑定、冲突复核、合规检查、报告生成和安全审查拆分为可追溯节点；4. 完成前端文档接入、文档库、任务状态、RAG 知识库、指标探索、智能洞察和综合审计报告展示。</w:t>
+            </w:r>
+          </w:p>
+          <w:p>
+            <w:pPr>
+              <w:spacing w:before="0" w:after="0" w:line="260" w:lineRule="auto"/>
+            </w:pPr>
+            <w:r>
+              <w:rPr>
+                <w:rFonts w:ascii="宋体" w:eastAsia="宋体"/>
+                <w:sz w:val="20"/>
+                <w:szCs w:val="20"/>
+              </w:rPr>
+              <w:t>目标是形成能够本地运行、可演示、可复核的医疗资料审计辅助系统，使系统输出能够回溯到具体文档版本、指标和审计事件，并在论文中完成需求分析、系统设计、实现说明和测试验证。</w:t>
+            </w:r>
+          </w:p>
+        </w:tc>
+      </w:tr>
+      <w:tr>
+        <w:tblPrEx>
+          <w:tblBorders>
+            <w:top w:val="single" w:color="auto" w:sz="8" w:space="0"/>
+            <w:left w:val="single" w:color="auto" w:sz="8" w:space="0"/>
+            <w:bottom w:val="single" w:color="auto" w:sz="8" w:space="0"/>
+            <w:right w:val="single" w:color="auto" w:sz="8" w:space="0"/>
+            <w:insideH w:val="single" w:color="auto" w:sz="8" w:space="0"/>
+            <w:insideV w:val="single" w:color="auto" w:sz="8" w:space="0"/>
+          </w:tblBorders>
+          <w:tblCellMar>
+            <w:top w:w="0" w:type="dxa"/>
+            <w:left w:w="108" w:type="dxa"/>
+            <w:bottom w:w="0" w:type="dxa"/>
+            <w:right w:w="108" w:type="dxa"/>
+          </w:tblCellMar>
+        </w:tblPrEx>
+        <w:trPr>
+          <w:cantSplit/>
+          <w:trHeight w:val="1917" w:hRule="atLeast"/>
+          <w:jc w:val="center"/>
+        </w:trPr>
+        <w:tc>
+          <w:tcPr>
+            <w:tcW w:w="1165" w:type="dxa"/>
+            <w:tcBorders>
+              <w:top w:val="single" w:color="auto" w:sz="4" w:space="0"/>
+              <w:left w:val="single" w:color="auto" w:sz="4" w:space="0"/>
+              <w:bottom w:val="single" w:color="auto" w:sz="4" w:space="0"/>
+              <w:right w:val="single" w:color="auto" w:sz="4" w:space="0"/>
+            </w:tcBorders>
+            <w:vAlign w:val="center"/>
+          </w:tcPr>
+          <w:p>
+            <w:pPr>
+              <w:jc w:val="center"/>
+              <w:rPr>
+                <w:rFonts w:ascii="Times New Roman" w:eastAsia="汉仪书宋一简"/>
+                <w:b/>
+                <w:bCs/>
+                <w:sz w:val="21"/>
+              </w:rPr>
+            </w:pPr>
+            <w:r>
+              <w:rPr>
+                <w:rFonts w:ascii="Times New Roman" w:eastAsia="汉仪书宋一简"/>
+                <w:b/>
+                <w:bCs/>
+                <w:sz w:val="21"/>
+              </w:rPr>
+              <w:t>成果</w:t>
+            </w:r>
+          </w:p>
+          <w:p>
+            <w:pPr>
+              <w:jc w:val="center"/>
+              <w:rPr>
+                <w:rFonts w:ascii="Times New Roman" w:eastAsia="汉仪书宋一简"/>
+                <w:b/>
+                <w:bCs/>
+                <w:sz w:val="21"/>
+              </w:rPr>
+            </w:pPr>
+            <w:r>
+              <w:rPr>
+                <w:rFonts w:ascii="Times New Roman" w:eastAsia="汉仪书宋一简"/>
+                <w:b/>
+                <w:bCs/>
+                <w:sz w:val="21"/>
+              </w:rPr>
+              <w:t>形式</w:t>
+            </w:r>
+          </w:p>
+        </w:tc>
+        <w:tc>
+          <w:tcPr>
+            <w:tcW w:w="7936" w:type="dxa"/>
+            <w:gridSpan w:val="9"/>
+            <w:tcBorders>
+              <w:top w:val="single" w:color="auto" w:sz="4" w:space="0"/>
+              <w:left w:val="single" w:color="auto" w:sz="4" w:space="0"/>
+              <w:bottom w:val="single" w:color="auto" w:sz="4" w:space="0"/>
+              <w:right w:val="single" w:color="auto" w:sz="4" w:space="0"/>
+            </w:tcBorders>
+          </w:tcPr>
+          <w:p>
+            <w:pPr>
+              <w:spacing w:before="0" w:after="0" w:line="260" w:lineRule="auto"/>
+            </w:pPr>
+            <w:r>
+              <w:rPr>
+                <w:rFonts w:ascii="宋体" w:eastAsia="宋体"/>
+                <w:sz w:val="20"/>
+                <w:szCs w:val="20"/>
+              </w:rPr>
+              <w:t>成果包括：1. 后端 FastAPI 服务、数据库迁移脚本、Provider 抽象、任务队列与 LangGraph 审计流程代码；2. React 前端演示页面；3. Mock 体检类与报告类数据、演示账号和端到端测试脚本；4. 数据库结构、接口、流程图、运行截图和毕业设计论文。</w:t>
+            </w:r>
+          </w:p>
+          <w:p>
+            <w:pPr>
+              <w:spacing w:before="0" w:after="0" w:line="260" w:lineRule="auto"/>
+            </w:pPr>
+            <w:r>
+              <w:rPr>
+                <w:rFonts w:ascii="宋体" w:eastAsia="宋体"/>
+                <w:sz w:val="20"/>
+                <w:szCs w:val="20"/>
+              </w:rPr>
+              <w:t>验收方式包括本地启动前后端服务，使用 admin@qq.com 演示账号完成资料接入、OCR/标准化、文档查询、任务监控、RAG 检索和综合审计报告生成，并通过接口测试、数据库记录和前端截图验证关键功能闭环。</w:t>
+            </w:r>
+          </w:p>
+        </w:tc>
+      </w:tr>
+      <w:tr>
+        <w:tblPrEx>
+          <w:tblBorders>
+            <w:top w:val="single" w:color="auto" w:sz="8" w:space="0"/>
+            <w:left w:val="single" w:color="auto" w:sz="8" w:space="0"/>
+            <w:bottom w:val="single" w:color="auto" w:sz="8" w:space="0"/>
+            <w:right w:val="single" w:color="auto" w:sz="8" w:space="0"/>
+            <w:insideH w:val="single" w:color="auto" w:sz="8" w:space="0"/>
+            <w:insideV w:val="single" w:color="auto" w:sz="8" w:space="0"/>
+          </w:tblBorders>
+          <w:tblCellMar>
+            <w:top w:w="0" w:type="dxa"/>
+            <w:left w:w="108" w:type="dxa"/>
+            <w:bottom w:w="0" w:type="dxa"/>
+            <w:right w:w="108" w:type="dxa"/>
+          </w:tblCellMar>
+        </w:tblPrEx>
+        <w:trPr>
+          <w:cantSplit/>
+          <w:trHeight w:val="2399" w:hRule="atLeast"/>
+          <w:jc w:val="center"/>
+        </w:trPr>
+        <w:tc>
+          <w:tcPr>
+            <w:tcW w:w="1165" w:type="dxa"/>
+            <w:tcBorders>
+              <w:top w:val="single" w:color="auto" w:sz="4" w:space="0"/>
+              <w:left w:val="single" w:color="auto" w:sz="4" w:space="0"/>
+              <w:bottom w:val="single" w:color="auto" w:sz="4" w:space="0"/>
+              <w:right w:val="single" w:color="auto" w:sz="4" w:space="0"/>
+            </w:tcBorders>
+            <w:vAlign w:val="center"/>
+          </w:tcPr>
+          <w:p>
+            <w:pPr>
+              <w:jc w:val="center"/>
+              <w:rPr>
+                <w:rFonts w:ascii="Times New Roman" w:eastAsia="汉仪书宋一简"/>
+                <w:b/>
+                <w:bCs/>
+                <w:sz w:val="21"/>
+              </w:rPr>
+            </w:pPr>
+            <w:r>
+              <w:rPr>
+                <w:rFonts w:ascii="Times New Roman" w:eastAsia="汉仪书宋一简"/>
+                <w:b/>
+                <w:bCs/>
+                <w:sz w:val="21"/>
+              </w:rPr>
+              <w:t>基本</w:t>
+            </w:r>
+          </w:p>
+          <w:p>
+            <w:pPr>
+              <w:jc w:val="center"/>
+              <w:rPr>
+                <w:rFonts w:ascii="Times New Roman" w:eastAsia="汉仪书宋一简"/>
+                <w:b/>
+                <w:bCs/>
+                <w:sz w:val="21"/>
+              </w:rPr>
+            </w:pPr>
+            <w:r>
+              <w:rPr>
+                <w:rFonts w:ascii="Times New Roman" w:eastAsia="汉仪书宋一简"/>
+                <w:b/>
+                <w:bCs/>
+                <w:sz w:val="21"/>
+              </w:rPr>
+              <w:t>要求</w:t>
+            </w:r>
+          </w:p>
+        </w:tc>
+        <w:tc>
+          <w:tcPr>
+            <w:tcW w:w="7936" w:type="dxa"/>
+            <w:gridSpan w:val="9"/>
+            <w:tcBorders>
+              <w:top w:val="single" w:color="auto" w:sz="4" w:space="0"/>
+              <w:left w:val="single" w:color="auto" w:sz="4" w:space="0"/>
+              <w:bottom w:val="single" w:color="auto" w:sz="4" w:space="0"/>
+              <w:right w:val="single" w:color="auto" w:sz="4" w:space="0"/>
+            </w:tcBorders>
+          </w:tcPr>
+          <w:p>
+            <w:pPr>
+              <w:spacing w:before="0" w:after="0" w:line="260" w:lineRule="auto"/>
+            </w:pPr>
+            <w:r>
+              <w:rPr>
+                <w:rFonts w:ascii="宋体" w:eastAsia="宋体"/>
+                <w:sz w:val="20"/>
+                <w:szCs w:val="20"/>
+              </w:rPr>
+              <w:t>1. 系统应采用前后端分离架构，后端使用 Python、FastAPI、SQLAlchemy、Alembic 和 MySQL，前端使用 Vite/React 技术栈。</w:t>
+            </w:r>
+          </w:p>
+          <w:p>
+            <w:pPr>
+              <w:spacing w:before="0" w:after="0" w:line="260" w:lineRule="auto"/>
+            </w:pPr>
+            <w:r>
+              <w:rPr>
+                <w:rFonts w:ascii="宋体" w:eastAsia="宋体"/>
+                <w:sz w:val="20"/>
+                <w:szCs w:val="20"/>
+              </w:rPr>
+              <w:t>2. OCR、标准化、LLM 和存储能力应通过 Provider 抽象隔离，能够记录调用状态、耗时和异常信息。</w:t>
+            </w:r>
+          </w:p>
+          <w:p>
+            <w:pPr>
+              <w:spacing w:before="0" w:after="0" w:line="260" w:lineRule="auto"/>
+            </w:pPr>
+            <w:r>
+              <w:rPr>
+                <w:rFonts w:ascii="宋体" w:eastAsia="宋体"/>
+                <w:sz w:val="20"/>
+                <w:szCs w:val="20"/>
+              </w:rPr>
+              <w:t>3. 数据库应保留原始文件、OCR 原文、标准化版本、结构化指标、任务事件和审计事件，支持从最终报告回溯到原始资料。</w:t>
+            </w:r>
+          </w:p>
+          <w:p>
+            <w:pPr>
+              <w:spacing w:before="0" w:after="0" w:line="260" w:lineRule="auto"/>
+            </w:pPr>
+            <w:r>
+              <w:rPr>
+                <w:rFonts w:ascii="宋体" w:eastAsia="宋体"/>
+                <w:sz w:val="20"/>
+                <w:szCs w:val="20"/>
+              </w:rPr>
+              <w:t>4. 综合审计报告不得给出诊断结论，应体现非诊断性风险提示、证据绑定、知识来源和安全审查。</w:t>
+            </w:r>
+          </w:p>
+          <w:p>
+            <w:pPr>
+              <w:spacing w:before="0" w:after="0" w:line="260" w:lineRule="auto"/>
+            </w:pPr>
+            <w:r>
+              <w:rPr>
+                <w:rFonts w:ascii="宋体" w:eastAsia="宋体"/>
+                <w:sz w:val="20"/>
+                <w:szCs w:val="20"/>
+              </w:rPr>
+              <w:t>5. 系统应能使用 Mock 数据稳定完成本地演示，并保留后续上线扩展空间。</w:t>
+            </w:r>
+          </w:p>
+        </w:tc>
+      </w:tr>
+      <w:tr>
+        <w:tblPrEx>
+          <w:tblBorders>
+            <w:top w:val="single" w:color="auto" w:sz="8" w:space="0"/>
+            <w:left w:val="single" w:color="auto" w:sz="8" w:space="0"/>
+            <w:bottom w:val="single" w:color="auto" w:sz="8" w:space="0"/>
+            <w:right w:val="single" w:color="auto" w:sz="8" w:space="0"/>
+            <w:insideH w:val="single" w:color="auto" w:sz="8" w:space="0"/>
+            <w:insideV w:val="single" w:color="auto" w:sz="8" w:space="0"/>
+          </w:tblBorders>
+          <w:tblCellMar>
+            <w:top w:w="0" w:type="dxa"/>
+            <w:left w:w="108" w:type="dxa"/>
+            <w:bottom w:w="0" w:type="dxa"/>
+            <w:right w:w="108" w:type="dxa"/>
+          </w:tblCellMar>
+        </w:tblPrEx>
+        <w:trPr>
+          <w:cantSplit/>
+          <w:trHeight w:val="2324" w:hRule="atLeast"/>
+          <w:jc w:val="center"/>
+        </w:trPr>
+        <w:tc>
+          <w:tcPr>
+            <w:tcW w:w="1165" w:type="dxa"/>
+            <w:tcBorders>
+              <w:top w:val="single" w:color="auto" w:sz="4" w:space="0"/>
+              <w:left w:val="single" w:color="auto" w:sz="4" w:space="0"/>
+              <w:bottom w:val="single" w:color="auto" w:sz="4" w:space="0"/>
+              <w:right w:val="single" w:color="auto" w:sz="4" w:space="0"/>
+            </w:tcBorders>
+            <w:vAlign w:val="center"/>
+          </w:tcPr>
+          <w:p>
+            <w:pPr>
+              <w:jc w:val="center"/>
+              <w:rPr>
+                <w:rFonts w:ascii="Times New Roman" w:eastAsia="汉仪书宋一简"/>
+                <w:b/>
+                <w:bCs/>
+                <w:sz w:val="21"/>
+              </w:rPr>
+            </w:pPr>
+            <w:r>
+              <w:rPr>
+                <w:rFonts w:ascii="Times New Roman" w:eastAsia="汉仪书宋一简"/>
+                <w:b/>
+                <w:bCs/>
+                <w:sz w:val="21"/>
+              </w:rPr>
+              <w:t>实习</w:t>
+            </w:r>
+          </w:p>
+          <w:p>
+            <w:pPr>
+              <w:jc w:val="center"/>
+              <w:rPr>
+                <w:rFonts w:ascii="Times New Roman" w:eastAsia="汉仪书宋一简"/>
+                <w:b/>
+                <w:bCs/>
+                <w:sz w:val="21"/>
+              </w:rPr>
+            </w:pPr>
+            <w:r>
+              <w:rPr>
+                <w:rFonts w:ascii="Times New Roman" w:eastAsia="汉仪书宋一简"/>
+                <w:b/>
+                <w:bCs/>
+                <w:sz w:val="21"/>
+              </w:rPr>
+              <w:t>调研</w:t>
+            </w:r>
+          </w:p>
+          <w:p>
+            <w:pPr>
+              <w:jc w:val="center"/>
+              <w:rPr>
+                <w:rFonts w:ascii="Times New Roman" w:eastAsia="汉仪书宋一简"/>
+                <w:b/>
+                <w:bCs/>
+                <w:sz w:val="21"/>
+              </w:rPr>
+            </w:pPr>
+            <w:r>
+              <w:rPr>
+                <w:rFonts w:ascii="Times New Roman" w:eastAsia="汉仪书宋一简"/>
+                <w:b/>
+                <w:bCs/>
+                <w:sz w:val="21"/>
+              </w:rPr>
+              <w:t>要求</w:t>
+            </w:r>
+          </w:p>
+        </w:tc>
+        <w:tc>
+          <w:tcPr>
+            <w:tcW w:w="7936" w:type="dxa"/>
+            <w:gridSpan w:val="9"/>
+            <w:tcBorders>
+              <w:top w:val="single" w:color="auto" w:sz="4" w:space="0"/>
+              <w:left w:val="single" w:color="auto" w:sz="4" w:space="0"/>
+              <w:bottom w:val="single" w:color="auto" w:sz="4" w:space="0"/>
+              <w:right w:val="single" w:color="auto" w:sz="4" w:space="0"/>
+            </w:tcBorders>
+          </w:tcPr>
+          <w:p>
+            <w:pPr>
+              <w:spacing w:before="0" w:after="0" w:line="260" w:lineRule="auto"/>
+            </w:pPr>
+            <w:r>
+              <w:rPr>
+                <w:rFonts w:ascii="宋体" w:eastAsia="宋体"/>
+                <w:sz w:val="20"/>
+                <w:szCs w:val="20"/>
+              </w:rPr>
+              <w:t>结合开题报告和项目实现，调研医疗资料数字化、电子病历文本挖掘、RAG、ReAct、多 Agent 协作、LangGraph 状态机、医院信息化和个人信息安全相关资料；整理体检报告、化验单、病历摘要等样例格式，明确系统边界、测试数据构造方式和论文引用来源。</w:t>
+            </w:r>
+          </w:p>
+        </w:tc>
+      </w:tr>
+      <w:tr>
+        <w:tblPrEx>
+          <w:tblBorders>
+            <w:top w:val="single" w:color="auto" w:sz="8" w:space="0"/>
+            <w:left w:val="single" w:color="auto" w:sz="8" w:space="0"/>
+            <w:bottom w:val="single" w:color="auto" w:sz="8" w:space="0"/>
+            <w:right w:val="single" w:color="auto" w:sz="8" w:space="0"/>
+            <w:insideH w:val="single" w:color="auto" w:sz="8" w:space="0"/>
+            <w:insideV w:val="single" w:color="auto" w:sz="8" w:space="0"/>
+          </w:tblBorders>
+          <w:tblCellMar>
+            <w:top w:w="0" w:type="dxa"/>
+            <w:left w:w="108" w:type="dxa"/>
+            <w:bottom w:w="0" w:type="dxa"/>
+            <w:right w:w="108" w:type="dxa"/>
+          </w:tblCellMar>
+        </w:tblPrEx>
+        <w:trPr>
+          <w:cantSplit/>
+          <w:trHeight w:val="2324" w:hRule="atLeast"/>
+          <w:jc w:val="center"/>
+        </w:trPr>
+        <w:tc>
+          <w:tcPr>
+            <w:tcW w:w="1165" w:type="dxa"/>
+            <w:tcBorders>
+              <w:top w:val="single" w:color="auto" w:sz="4" w:space="0"/>
+              <w:left w:val="single" w:color="auto" w:sz="4" w:space="0"/>
+              <w:bottom w:val="single" w:color="auto" w:sz="4" w:space="0"/>
+              <w:right w:val="single" w:color="auto" w:sz="4" w:space="0"/>
+            </w:tcBorders>
+            <w:vAlign w:val="center"/>
+          </w:tcPr>
+          <w:p>
+            <w:pPr>
+              <w:jc w:val="center"/>
+              <w:rPr>
+                <w:rFonts w:ascii="Times New Roman" w:eastAsia="汉仪书宋一简"/>
+                <w:b/>
+                <w:bCs/>
+                <w:sz w:val="21"/>
+              </w:rPr>
+            </w:pPr>
+            <w:r>
+              <w:rPr>
+                <w:rFonts w:ascii="Times New Roman" w:eastAsia="汉仪书宋一简"/>
+                <w:b/>
+                <w:bCs/>
+                <w:sz w:val="21"/>
+              </w:rPr>
+              <w:t>主要</w:t>
+            </w:r>
+          </w:p>
+          <w:p>
+            <w:pPr>
+              <w:jc w:val="center"/>
+              <w:rPr>
+                <w:rFonts w:ascii="Times New Roman" w:eastAsia="汉仪书宋一简"/>
+                <w:b/>
+                <w:bCs/>
+                <w:sz w:val="21"/>
+              </w:rPr>
+            </w:pPr>
+            <w:r>
+              <w:rPr>
+                <w:rFonts w:ascii="Times New Roman" w:eastAsia="汉仪书宋一简"/>
+                <w:b/>
+                <w:bCs/>
+                <w:sz w:val="21"/>
+              </w:rPr>
+              <w:t>参考</w:t>
+            </w:r>
+          </w:p>
+          <w:p>
+            <w:pPr>
+              <w:jc w:val="center"/>
+              <w:rPr>
+                <w:rFonts w:ascii="Times New Roman" w:eastAsia="汉仪书宋一简"/>
+                <w:b/>
+                <w:bCs/>
+                <w:sz w:val="21"/>
+              </w:rPr>
+            </w:pPr>
+            <w:r>
+              <w:rPr>
+                <w:rFonts w:ascii="Times New Roman" w:eastAsia="汉仪书宋一简"/>
+                <w:b/>
+                <w:bCs/>
+                <w:sz w:val="21"/>
+              </w:rPr>
+              <w:t>文献</w:t>
+            </w:r>
+          </w:p>
+        </w:tc>
+        <w:tc>
+          <w:tcPr>
+            <w:tcW w:w="7936" w:type="dxa"/>
+            <w:gridSpan w:val="9"/>
+            <w:tcBorders>
+              <w:top w:val="single" w:color="auto" w:sz="4" w:space="0"/>
+              <w:left w:val="single" w:color="auto" w:sz="4" w:space="0"/>
+              <w:bottom w:val="single" w:color="auto" w:sz="4" w:space="0"/>
+              <w:right w:val="single" w:color="auto" w:sz="4" w:space="0"/>
+            </w:tcBorders>
+          </w:tcPr>
+          <w:p>
+            <w:pPr>
+              <w:spacing w:before="0" w:after="0" w:line="260" w:lineRule="auto"/>
+            </w:pPr>
+            <w:r>
+              <w:rPr>
+                <w:rFonts w:ascii="宋体" w:eastAsia="宋体"/>
+                <w:sz w:val="20"/>
+                <w:szCs w:val="20"/>
+              </w:rPr>
+              <w:t>[1] 国家卫生健康委员会规划与信息司. 全国医院信息化建设标准与规范（试行）[S/OL]. 2018.</w:t>
+            </w:r>
+          </w:p>
+          <w:p>
+            <w:pPr>
+              <w:spacing w:before="0" w:after="0" w:line="260" w:lineRule="auto"/>
+            </w:pPr>
+            <w:r>
+              <w:rPr>
+                <w:rFonts w:ascii="宋体" w:eastAsia="宋体"/>
+                <w:sz w:val="20"/>
+                <w:szCs w:val="20"/>
+              </w:rPr>
+              <w:t>[2] 国家卫生健康委办公厅. 电子病历系统应用水平分级评价管理办法（试行）及评价标准（试行）[Z/OL]. 2018.</w:t>
+            </w:r>
+          </w:p>
+          <w:p>
+            <w:pPr>
+              <w:spacing w:before="0" w:after="0" w:line="260" w:lineRule="auto"/>
+            </w:pPr>
+            <w:r>
+              <w:rPr>
+                <w:rFonts w:ascii="宋体" w:eastAsia="宋体"/>
+                <w:sz w:val="20"/>
+                <w:szCs w:val="20"/>
+              </w:rPr>
+              <w:t>[3] 国家市场监督管理总局, 国家标准化管理委员会. 信息安全技术 个人信息安全规范: GB/T 35273-2020[S]. 北京: 中国标准出版社, 2020.</w:t>
+            </w:r>
+          </w:p>
+          <w:p>
+            <w:pPr>
+              <w:spacing w:before="0" w:after="0" w:line="260" w:lineRule="auto"/>
+            </w:pPr>
+            <w:r>
+              <w:rPr>
+                <w:rFonts w:ascii="宋体" w:eastAsia="宋体"/>
+                <w:sz w:val="20"/>
+                <w:szCs w:val="20"/>
+              </w:rPr>
+              <w:t>[4] 吴宗友, 白昆龙, 杨林蕊, 等. 电子病历文本挖掘研究综述[J]. 计算机研究与发展, 2021,58(3):513-527.</w:t>
+            </w:r>
+          </w:p>
+          <w:p>
+            <w:pPr>
+              <w:spacing w:before="0" w:after="0" w:line="260" w:lineRule="auto"/>
+            </w:pPr>
+            <w:r>
+              <w:rPr>
+                <w:rFonts w:ascii="宋体" w:eastAsia="宋体"/>
+                <w:sz w:val="20"/>
+                <w:szCs w:val="20"/>
+              </w:rPr>
+              <w:t>[5] Lewis P, Perez E, Piktus A, et al. Retrieval-Augmented Generation for Knowledge-Intensive NLP Tasks[C]//Advances in Neural Information Processing Systems. 2020.</w:t>
+            </w:r>
+          </w:p>
+          <w:p>
+            <w:pPr>
+              <w:spacing w:before="0" w:after="0" w:line="260" w:lineRule="auto"/>
+            </w:pPr>
+            <w:r>
+              <w:rPr>
+                <w:rFonts w:ascii="宋体" w:eastAsia="宋体"/>
+                <w:sz w:val="20"/>
+                <w:szCs w:val="20"/>
+              </w:rPr>
+              <w:t>[6] Yao S, Zhao J, Yu D, et al. ReAct: Synergizing Reasoning and Acting in Language Models[C]//International Conference on Learning Representations. 2023.</w:t>
+            </w:r>
+          </w:p>
+          <w:p>
+            <w:pPr>
+              <w:spacing w:before="0" w:after="0" w:line="260" w:lineRule="auto"/>
+            </w:pPr>
+            <w:r>
+              <w:rPr>
+                <w:rFonts w:ascii="宋体" w:eastAsia="宋体"/>
+                <w:sz w:val="20"/>
+                <w:szCs w:val="20"/>
+              </w:rPr>
+              <w:t>[7] Wu Q, Bansal G, Zhang J, et al. AutoGen: Enabling Next-Gen LLM Applications via Multi-Agent Conversation[EB/OL]. arXiv:2308.08155, 2023.</w:t>
+            </w:r>
+          </w:p>
+        </w:tc>
+      </w:tr>
+      <w:tr>
+        <w:tblPrEx>
+          <w:tblBorders>
+            <w:top w:val="single" w:color="auto" w:sz="8" w:space="0"/>
+            <w:left w:val="single" w:color="auto" w:sz="8" w:space="0"/>
+            <w:bottom w:val="single" w:color="auto" w:sz="8" w:space="0"/>
+            <w:right w:val="single" w:color="auto" w:sz="8" w:space="0"/>
+            <w:insideH w:val="single" w:color="auto" w:sz="8" w:space="0"/>
+            <w:insideV w:val="single" w:color="auto" w:sz="8" w:space="0"/>
+          </w:tblBorders>
+          <w:tblCellMar>
+            <w:top w:w="0" w:type="dxa"/>
+            <w:left w:w="108" w:type="dxa"/>
+            <w:bottom w:w="0" w:type="dxa"/>
+            <w:right w:w="108" w:type="dxa"/>
+          </w:tblCellMar>
+        </w:tblPrEx>
+        <w:trPr>
+          <w:cantSplit/>
+          <w:trHeight w:val="3082" w:hRule="atLeast"/>
+          <w:jc w:val="center"/>
+        </w:trPr>
+        <w:tc>
+          <w:tcPr>
+            <w:tcW w:w="1165" w:type="dxa"/>
+            <w:tcBorders>
+              <w:top w:val="single" w:color="auto" w:sz="4" w:space="0"/>
+              <w:left w:val="single" w:color="auto" w:sz="4" w:space="0"/>
+              <w:bottom w:val="single" w:color="auto" w:sz="4" w:space="0"/>
+              <w:right w:val="single" w:color="auto" w:sz="4" w:space="0"/>
+            </w:tcBorders>
+            <w:vAlign w:val="center"/>
+          </w:tcPr>
+          <w:p>
+            <w:pPr>
+              <w:jc w:val="center"/>
+              <w:rPr>
+                <w:rFonts w:ascii="Times New Roman"/>
+                <w:b/>
+                <w:sz w:val="21"/>
+              </w:rPr>
+            </w:pPr>
+            <w:r>
+              <w:rPr>
+                <w:rFonts w:ascii="Times New Roman"/>
+                <w:b/>
+                <w:sz w:val="21"/>
+              </w:rPr>
+              <w:t>主要</w:t>
+            </w:r>
+          </w:p>
+          <w:p>
+            <w:pPr>
+              <w:jc w:val="center"/>
+              <w:rPr>
+                <w:rFonts w:ascii="Times New Roman"/>
+                <w:b/>
+                <w:sz w:val="21"/>
+              </w:rPr>
+            </w:pPr>
+            <w:r>
+              <w:rPr>
+                <w:rFonts w:ascii="Times New Roman"/>
+                <w:b/>
+                <w:sz w:val="21"/>
+              </w:rPr>
+              <w:t>仪器</w:t>
+            </w:r>
+          </w:p>
+          <w:p>
+            <w:pPr>
+              <w:jc w:val="center"/>
+              <w:rPr>
+                <w:rFonts w:ascii="Times New Roman"/>
+                <w:b/>
+                <w:sz w:val="21"/>
+              </w:rPr>
+            </w:pPr>
+            <w:r>
+              <w:rPr>
+                <w:rFonts w:ascii="Times New Roman"/>
+                <w:b/>
+                <w:sz w:val="21"/>
+              </w:rPr>
+              <w:t>设备</w:t>
+            </w:r>
+          </w:p>
+          <w:p>
+            <w:pPr>
+              <w:jc w:val="center"/>
+              <w:rPr>
+                <w:rFonts w:ascii="Times New Roman"/>
+                <w:b/>
+                <w:sz w:val="21"/>
+              </w:rPr>
+            </w:pPr>
+            <w:r>
+              <w:rPr>
+                <w:rFonts w:ascii="Times New Roman"/>
+                <w:b/>
+                <w:sz w:val="21"/>
+              </w:rPr>
+              <w:t>或</w:t>
+            </w:r>
+          </w:p>
+          <w:p>
+            <w:pPr>
+              <w:jc w:val="center"/>
+              <w:rPr>
+                <w:rFonts w:ascii="Times New Roman"/>
+                <w:b/>
+                <w:sz w:val="21"/>
+              </w:rPr>
+            </w:pPr>
+            <w:r>
+              <w:rPr>
+                <w:rFonts w:ascii="Times New Roman"/>
+                <w:b/>
+                <w:sz w:val="21"/>
+              </w:rPr>
+              <w:t>开发</w:t>
+            </w:r>
+          </w:p>
+          <w:p>
+            <w:pPr>
+              <w:jc w:val="center"/>
+              <w:rPr>
+                <w:rFonts w:ascii="Times New Roman" w:eastAsia="汉仪书宋一简"/>
+                <w:b/>
+                <w:bCs/>
+              </w:rPr>
+            </w:pPr>
+            <w:r>
+              <w:rPr>
+                <w:rFonts w:ascii="Times New Roman"/>
+                <w:b/>
+                <w:sz w:val="21"/>
+              </w:rPr>
+              <w:t>环境</w:t>
+            </w:r>
+          </w:p>
+        </w:tc>
+        <w:tc>
+          <w:tcPr>
+            <w:tcW w:w="7936" w:type="dxa"/>
+            <w:gridSpan w:val="9"/>
+            <w:tcBorders>
+              <w:top w:val="single" w:color="auto" w:sz="4" w:space="0"/>
+              <w:left w:val="single" w:color="auto" w:sz="4" w:space="0"/>
+              <w:bottom w:val="single" w:color="auto" w:sz="4" w:space="0"/>
+              <w:right w:val="single" w:color="auto" w:sz="4" w:space="0"/>
+            </w:tcBorders>
+          </w:tcPr>
+          <w:p>
+            <w:pPr>
+              <w:spacing w:before="0" w:after="0" w:line="260" w:lineRule="auto"/>
+            </w:pPr>
+            <w:r>
+              <w:rPr>
+                <w:rFonts w:ascii="宋体" w:eastAsia="宋体"/>
+                <w:sz w:val="20"/>
+                <w:szCs w:val="20"/>
+              </w:rPr>
+              <w:t>开发环境包括 macOS/Windows 或 Linux、Python 3.11、FastAPI、Pydantic、SQLAlchemy、Alembic、MySQL、pytest、Node.js、Vite、React、LangGraph、Git、GitHub，以及百度 OCR 和兼容 OpenAI 协议的大模型接口。</w:t>
+            </w:r>
+          </w:p>
+        </w:tc>
+      </w:tr>
+      <w:tr>
+        <w:tblPrEx>
+          <w:tblBorders>
+            <w:top w:val="single" w:color="auto" w:sz="8" w:space="0"/>
+            <w:left w:val="single" w:color="auto" w:sz="8" w:space="0"/>
+            <w:bottom w:val="single" w:color="auto" w:sz="8" w:space="0"/>
+            <w:right w:val="single" w:color="auto" w:sz="8" w:space="0"/>
+            <w:insideH w:val="single" w:color="auto" w:sz="8" w:space="0"/>
+            <w:insideV w:val="single" w:color="auto" w:sz="8" w:space="0"/>
+          </w:tblBorders>
+          <w:tblCellMar>
+            <w:top w:w="0" w:type="dxa"/>
+            <w:left w:w="108" w:type="dxa"/>
+            <w:bottom w:w="0" w:type="dxa"/>
+            <w:right w:w="108" w:type="dxa"/>
+          </w:tblCellMar>
+        </w:tblPrEx>
+        <w:trPr>
+          <w:cantSplit/>
+          <w:trHeight w:val="927" w:hRule="atLeast"/>
+          <w:jc w:val="center"/>
+        </w:trPr>
+        <w:tc>
+          <w:tcPr>
+            <w:tcW w:w="2547" w:type="dxa"/>
+            <w:gridSpan w:val="2"/>
+            <w:tcBorders>
+              <w:top w:val="single" w:color="auto" w:sz="4" w:space="0"/>
+              <w:left w:val="single" w:color="auto" w:sz="4" w:space="0"/>
+              <w:bottom w:val="single" w:color="auto" w:sz="4" w:space="0"/>
+              <w:right w:val="single" w:color="auto" w:sz="4" w:space="0"/>
+            </w:tcBorders>
+            <w:vAlign w:val="center"/>
+          </w:tcPr>
+          <w:p>
+            <w:pPr>
+              <w:spacing w:line="360" w:lineRule="auto"/>
+              <w:jc w:val="center"/>
+              <w:rPr>
+                <w:rFonts w:ascii="Times New Roman"/>
+                <w:b/>
+                <w:bCs/>
+                <w:w w:val="80"/>
+                <w:szCs w:val="24"/>
+              </w:rPr>
+            </w:pPr>
+            <w:r>
+              <w:rPr>
+                <w:rFonts w:ascii="Times New Roman"/>
+                <w:b/>
+                <w:bCs/>
+                <w:w w:val="80"/>
+                <w:szCs w:val="24"/>
+              </w:rPr>
+              <w:t>毕业设计（论文）开始</w:t>
+            </w:r>
+          </w:p>
+          <w:p>
+            <w:pPr>
+              <w:spacing w:line="360" w:lineRule="auto"/>
+              <w:jc w:val="center"/>
+              <w:rPr>
+                <w:rFonts w:ascii="Times New Roman"/>
+                <w:b/>
+                <w:bCs/>
+                <w:w w:val="80"/>
+                <w:szCs w:val="24"/>
+              </w:rPr>
+            </w:pPr>
+            <w:r>
+              <w:rPr>
+                <w:rFonts w:ascii="Times New Roman"/>
+                <w:b/>
+                <w:bCs/>
+                <w:w w:val="80"/>
+                <w:szCs w:val="24"/>
+              </w:rPr>
+              <w:t>日期</w:t>
+            </w:r>
+          </w:p>
+        </w:tc>
+        <w:tc>
+          <w:tcPr>
+            <w:tcW w:w="2097" w:type="dxa"/>
+            <w:gridSpan w:val="2"/>
+            <w:tcBorders>
+              <w:top w:val="single" w:color="auto" w:sz="4" w:space="0"/>
+              <w:left w:val="single" w:color="auto" w:sz="4" w:space="0"/>
+              <w:bottom w:val="single" w:color="auto" w:sz="4" w:space="0"/>
+              <w:right w:val="single" w:color="auto" w:sz="4" w:space="0"/>
+            </w:tcBorders>
+            <w:vAlign w:val="center"/>
+          </w:tcPr>
+          <w:p>
+            <w:pPr>
+              <w:spacing w:before="0" w:after="0" w:line="260" w:lineRule="auto"/>
+            </w:pPr>
+            <w:r>
+              <w:rPr>
+                <w:rFonts w:ascii="宋体" w:eastAsia="宋体"/>
+                <w:sz w:val="20"/>
+                <w:szCs w:val="20"/>
+              </w:rPr>
+              <w:t>2026年2月23日</w:t>
+            </w:r>
+          </w:p>
+        </w:tc>
+        <w:tc>
+          <w:tcPr>
+            <w:tcW w:w="2281" w:type="dxa"/>
+            <w:gridSpan w:val="3"/>
+            <w:tcBorders>
+              <w:top w:val="single" w:color="auto" w:sz="4" w:space="0"/>
+              <w:left w:val="single" w:color="auto" w:sz="4" w:space="0"/>
+              <w:bottom w:val="single" w:color="auto" w:sz="4" w:space="0"/>
+              <w:right w:val="single" w:color="auto" w:sz="4" w:space="0"/>
+            </w:tcBorders>
+            <w:vAlign w:val="center"/>
+          </w:tcPr>
+          <w:p>
+            <w:pPr>
+              <w:spacing w:line="360" w:lineRule="auto"/>
+              <w:jc w:val="center"/>
+              <w:rPr>
+                <w:rFonts w:ascii="Times New Roman"/>
+                <w:b/>
+                <w:bCs/>
+                <w:w w:val="80"/>
+                <w:szCs w:val="24"/>
+              </w:rPr>
+            </w:pPr>
+            <w:r>
+              <w:rPr>
+                <w:rFonts w:ascii="Times New Roman"/>
+                <w:b/>
+                <w:bCs/>
+                <w:w w:val="80"/>
+                <w:szCs w:val="24"/>
+              </w:rPr>
+              <w:t>毕业设计（论文）完成日期</w:t>
+            </w:r>
+          </w:p>
+        </w:tc>
+        <w:tc>
+          <w:tcPr>
+            <w:tcW w:w="2176" w:type="dxa"/>
+            <w:gridSpan w:val="3"/>
+            <w:tcBorders>
+              <w:top w:val="single" w:color="auto" w:sz="4" w:space="0"/>
+              <w:left w:val="single" w:color="auto" w:sz="4" w:space="0"/>
+              <w:bottom w:val="single" w:color="auto" w:sz="4" w:space="0"/>
+              <w:right w:val="single" w:color="auto" w:sz="4" w:space="0"/>
+            </w:tcBorders>
+            <w:vAlign w:val="center"/>
+          </w:tcPr>
+          <w:p>
+            <w:pPr>
+              <w:spacing w:before="0" w:after="0" w:line="260" w:lineRule="auto"/>
+            </w:pPr>
+            <w:r>
+              <w:rPr>
+                <w:rFonts w:ascii="宋体" w:eastAsia="宋体"/>
+                <w:sz w:val="20"/>
+                <w:szCs w:val="20"/>
+              </w:rPr>
+              <w:t>2026年5月22日</w:t>
+            </w:r>
+          </w:p>
+        </w:tc>
+      </w:tr>
+      <w:tr>
+        <w:tblPrEx>
+          <w:tblBorders>
+            <w:top w:val="single" w:color="auto" w:sz="8" w:space="0"/>
+            <w:left w:val="single" w:color="auto" w:sz="8" w:space="0"/>
+            <w:bottom w:val="single" w:color="auto" w:sz="8" w:space="0"/>
+            <w:right w:val="single" w:color="auto" w:sz="8" w:space="0"/>
+            <w:insideH w:val="single" w:color="auto" w:sz="8" w:space="0"/>
+            <w:insideV w:val="single" w:color="auto" w:sz="8" w:space="0"/>
+          </w:tblBorders>
+          <w:tblCellMar>
+            <w:top w:w="0" w:type="dxa"/>
+            <w:left w:w="108" w:type="dxa"/>
+            <w:bottom w:w="0" w:type="dxa"/>
+            <w:right w:w="108" w:type="dxa"/>
+          </w:tblCellMar>
+        </w:tblPrEx>
+        <w:trPr>
+          <w:cantSplit/>
+          <w:trHeight w:val="742" w:hRule="atLeast"/>
+          <w:jc w:val="center"/>
+        </w:trPr>
+        <w:tc>
+          <w:tcPr>
+            <w:tcW w:w="9101" w:type="dxa"/>
+            <w:gridSpan w:val="10"/>
+            <w:tcBorders>
+              <w:top w:val="single" w:color="auto" w:sz="4" w:space="0"/>
+              <w:left w:val="single" w:color="auto" w:sz="4" w:space="0"/>
+              <w:bottom w:val="single" w:color="auto" w:sz="4" w:space="0"/>
+              <w:right w:val="single" w:color="auto" w:sz="4" w:space="0"/>
+            </w:tcBorders>
+            <w:vAlign w:val="center"/>
+          </w:tcPr>
+          <w:p>
+            <w:pPr>
+              <w:spacing w:line="360" w:lineRule="auto"/>
+              <w:jc w:val="center"/>
+              <w:rPr>
+                <w:rFonts w:ascii="Times New Roman"/>
+                <w:b/>
+                <w:bCs/>
+                <w:szCs w:val="24"/>
+              </w:rPr>
+            </w:pPr>
+            <w:r>
+              <w:rPr>
+                <w:rFonts w:ascii="Times New Roman"/>
+                <w:b/>
+                <w:szCs w:val="24"/>
+              </w:rPr>
+              <w:t>毕业设计（论文）进度计划（起止时间、工作内容）</w:t>
+            </w:r>
+          </w:p>
+        </w:tc>
+      </w:tr>
+      <w:tr>
+        <w:tblPrEx>
+          <w:tblBorders>
+            <w:top w:val="single" w:color="auto" w:sz="8" w:space="0"/>
+            <w:left w:val="single" w:color="auto" w:sz="8" w:space="0"/>
+            <w:bottom w:val="single" w:color="auto" w:sz="8" w:space="0"/>
+            <w:right w:val="single" w:color="auto" w:sz="8" w:space="0"/>
+            <w:insideH w:val="single" w:color="auto" w:sz="8" w:space="0"/>
+            <w:insideV w:val="single" w:color="auto" w:sz="8" w:space="0"/>
+          </w:tblBorders>
+          <w:tblCellMar>
+            <w:top w:w="0" w:type="dxa"/>
+            <w:left w:w="108" w:type="dxa"/>
+            <w:bottom w:w="0" w:type="dxa"/>
+            <w:right w:w="108" w:type="dxa"/>
+          </w:tblCellMar>
+        </w:tblPrEx>
+        <w:trPr>
+          <w:cantSplit/>
+          <w:trHeight w:val="1602" w:hRule="atLeast"/>
+          <w:jc w:val="center"/>
+        </w:trPr>
+        <w:tc>
+          <w:tcPr>
+            <w:tcW w:w="9101" w:type="dxa"/>
+            <w:gridSpan w:val="10"/>
+            <w:tcBorders>
+              <w:top w:val="single" w:color="auto" w:sz="4" w:space="0"/>
+              <w:left w:val="single" w:color="auto" w:sz="4" w:space="0"/>
+              <w:bottom w:val="single" w:color="auto" w:sz="4" w:space="0"/>
+              <w:right w:val="single" w:color="auto" w:sz="4" w:space="0"/>
+            </w:tcBorders>
+            <w:vAlign w:val="center"/>
+          </w:tcPr>
+          <w:p>
+            <w:pPr>
+              <w:spacing w:before="0" w:after="0" w:line="260" w:lineRule="auto"/>
+            </w:pPr>
+            <w:r>
+              <w:rPr>
+                <w:rFonts w:ascii="宋体" w:eastAsia="宋体"/>
+                <w:sz w:val="20"/>
+                <w:szCs w:val="20"/>
+              </w:rPr>
+              <w:t>第1-3周：完成开题报告、需求边界、资料样例、文献和技术路线梳理。</w:t>
+            </w:r>
+          </w:p>
+          <w:p>
+            <w:pPr>
+              <w:spacing w:before="0" w:after="0" w:line="260" w:lineRule="auto"/>
+            </w:pPr>
+            <w:r>
+              <w:rPr>
+                <w:rFonts w:ascii="宋体" w:eastAsia="宋体"/>
+                <w:sz w:val="20"/>
+                <w:szCs w:val="20"/>
+              </w:rPr>
+              <w:t>第4-5周：完成用户、文件、OCR、文档版本、指标、任务事件等数据库模型和基础接口。</w:t>
+            </w:r>
+          </w:p>
+          <w:p>
+            <w:pPr>
+              <w:spacing w:before="0" w:after="0" w:line="260" w:lineRule="auto"/>
+            </w:pPr>
+            <w:r>
+              <w:rPr>
+                <w:rFonts w:ascii="宋体" w:eastAsia="宋体"/>
+                <w:sz w:val="20"/>
+                <w:szCs w:val="20"/>
+              </w:rPr>
+              <w:t>第6-7周：完成文档上传、OCR 抽取、标准化入库、任务状态监控和前端基础页面，达到中期检查要求。</w:t>
+            </w:r>
+          </w:p>
+          <w:p>
+            <w:pPr>
+              <w:spacing w:before="0" w:after="0" w:line="260" w:lineRule="auto"/>
+            </w:pPr>
+            <w:r>
+              <w:rPr>
+                <w:rFonts w:ascii="宋体" w:eastAsia="宋体"/>
+                <w:sz w:val="20"/>
+                <w:szCs w:val="20"/>
+              </w:rPr>
+              <w:t>第8-10周：完成 LangGraph 综合审计报告流程、RAG 知识检索、证据绑定、事件持久化和流程图展示。</w:t>
+            </w:r>
+          </w:p>
+          <w:p>
+            <w:pPr>
+              <w:spacing w:before="0" w:after="0" w:line="260" w:lineRule="auto"/>
+            </w:pPr>
+            <w:r>
+              <w:rPr>
+                <w:rFonts w:ascii="宋体" w:eastAsia="宋体"/>
+                <w:sz w:val="20"/>
+                <w:szCs w:val="20"/>
+              </w:rPr>
+              <w:t>第11-12周：完成 Mock 数据、接口测试、真实演示截图、论文初稿和定稿修改。</w:t>
+            </w:r>
+          </w:p>
+          <w:p>
+            <w:pPr>
+              <w:spacing w:before="0" w:after="0" w:line="260" w:lineRule="auto"/>
+            </w:pPr>
+            <w:r>
+              <w:rPr>
+                <w:rFonts w:ascii="宋体" w:eastAsia="宋体"/>
+                <w:sz w:val="20"/>
+                <w:szCs w:val="20"/>
+              </w:rPr>
+              <w:t>第13-15周：完成答辩资格材料、系统演示准备、论文复核和答辩。</w:t>
+            </w:r>
+          </w:p>
+        </w:tc>
+      </w:tr>
+      <w:tr>
+        <w:tblPrEx>
+          <w:tblBorders>
+            <w:top w:val="single" w:color="auto" w:sz="8" w:space="0"/>
+            <w:left w:val="single" w:color="auto" w:sz="8" w:space="0"/>
+            <w:bottom w:val="single" w:color="auto" w:sz="8" w:space="0"/>
+            <w:right w:val="single" w:color="auto" w:sz="8" w:space="0"/>
+            <w:insideH w:val="single" w:color="auto" w:sz="8" w:space="0"/>
+            <w:insideV w:val="single" w:color="auto" w:sz="8" w:space="0"/>
+          </w:tblBorders>
+          <w:tblCellMar>
+            <w:top w:w="0" w:type="dxa"/>
+            <w:left w:w="108" w:type="dxa"/>
+            <w:bottom w:w="0" w:type="dxa"/>
+            <w:right w:w="108" w:type="dxa"/>
+          </w:tblCellMar>
+        </w:tblPrEx>
+        <w:trPr>
+          <w:cantSplit/>
+          <w:trHeight w:val="890" w:hRule="atLeast"/>
+          <w:jc w:val="center"/>
+        </w:trPr>
+        <w:tc>
+          <w:tcPr>
+            <w:tcW w:w="9101" w:type="dxa"/>
+            <w:gridSpan w:val="10"/>
+            <w:tcBorders>
+              <w:top w:val="single" w:color="auto" w:sz="4" w:space="0"/>
+              <w:left w:val="single" w:color="auto" w:sz="4" w:space="0"/>
+              <w:bottom w:val="single" w:color="auto" w:sz="4" w:space="0"/>
+              <w:right w:val="single" w:color="auto" w:sz="4" w:space="0"/>
+            </w:tcBorders>
+            <w:vAlign w:val="center"/>
+          </w:tcPr>
+          <w:p>
+            <w:pPr>
+              <w:spacing w:before="0" w:after="0" w:line="260" w:lineRule="auto"/>
+            </w:pPr>
+            <w:r>
+              <w:rPr>
+                <w:rFonts w:ascii="宋体" w:eastAsia="宋体"/>
+                <w:sz w:val="20"/>
+                <w:szCs w:val="20"/>
+              </w:rPr>
+              <w:t>指导教师（签字）：                         2026年   月   日</w:t>
+            </w:r>
+          </w:p>
+          <w:p>
+            <w:pPr>
+              <w:spacing w:before="0" w:after="0" w:line="260" w:lineRule="auto"/>
+            </w:pPr>
+            <w:r>
+              <w:rPr>
+                <w:rFonts w:ascii="宋体" w:eastAsia="宋体"/>
+                <w:sz w:val="20"/>
+                <w:szCs w:val="20"/>
+              </w:rPr>
+              <w:t>督导教师（签字）：                              年   月   日</w:t>
+            </w:r>
+          </w:p>
+        </w:tc>
+      </w:tr>
+      <w:tr>
+        <w:tblPrEx>
+          <w:tblBorders>
+            <w:top w:val="single" w:color="auto" w:sz="8" w:space="0"/>
+            <w:left w:val="single" w:color="auto" w:sz="8" w:space="0"/>
+            <w:bottom w:val="single" w:color="auto" w:sz="8" w:space="0"/>
+            <w:right w:val="single" w:color="auto" w:sz="8" w:space="0"/>
+            <w:insideH w:val="single" w:color="auto" w:sz="8" w:space="0"/>
+            <w:insideV w:val="single" w:color="auto" w:sz="8" w:space="0"/>
+          </w:tblBorders>
+          <w:tblCellMar>
+            <w:top w:w="0" w:type="dxa"/>
+            <w:left w:w="108" w:type="dxa"/>
+            <w:bottom w:w="0" w:type="dxa"/>
+            <w:right w:w="108" w:type="dxa"/>
+          </w:tblCellMar>
+        </w:tblPrEx>
+        <w:trPr>
+          <w:cantSplit/>
+          <w:trHeight w:val="1227" w:hRule="atLeast"/>
+          <w:jc w:val="center"/>
+        </w:trPr>
+        <w:tc>
+          <w:tcPr>
+            <w:tcW w:w="9101" w:type="dxa"/>
+            <w:gridSpan w:val="10"/>
+            <w:tcBorders>
+              <w:top w:val="single" w:color="auto" w:sz="4" w:space="0"/>
+              <w:left w:val="single" w:color="auto" w:sz="4" w:space="0"/>
+              <w:bottom w:val="single" w:color="auto" w:sz="4" w:space="0"/>
+              <w:right w:val="single" w:color="auto" w:sz="4" w:space="0"/>
+            </w:tcBorders>
+            <w:vAlign w:val="center"/>
+          </w:tcPr>
+          <w:p>
+            <w:pPr>
+              <w:spacing w:before="0" w:after="0" w:line="260" w:lineRule="auto"/>
+            </w:pPr>
+            <w:r>
+              <w:rPr>
+                <w:rFonts w:ascii="宋体" w:eastAsia="宋体"/>
+                <w:sz w:val="20"/>
+                <w:szCs w:val="20"/>
+              </w:rPr>
+              <w:t>学院毕业设计（论文）领导小组审查意见：</w:t>
+            </w:r>
+          </w:p>
+          <w:p>
+            <w:pPr>
+              <w:spacing w:before="0" w:after="0" w:line="260" w:lineRule="auto"/>
+            </w:pPr>
+            <w:r>
+              <w:rPr>
+                <w:rFonts w:ascii="宋体" w:eastAsia="宋体"/>
+                <w:sz w:val="20"/>
+                <w:szCs w:val="20"/>
+              </w:rPr>
+              <w:t/>
+            </w:r>
+          </w:p>
+          <w:p>
+            <w:pPr>
+              <w:spacing w:before="0" w:after="0" w:line="260" w:lineRule="auto"/>
+            </w:pPr>
+            <w:r>
+              <w:rPr>
+                <w:rFonts w:ascii="宋体" w:eastAsia="宋体"/>
+                <w:sz w:val="20"/>
+                <w:szCs w:val="20"/>
+              </w:rPr>
+              <w:t/>
+            </w:r>
+          </w:p>
+          <w:p>
+            <w:pPr>
+              <w:spacing w:before="0" w:after="0" w:line="260" w:lineRule="auto"/>
+            </w:pPr>
+            <w:r>
+              <w:rPr>
+                <w:rFonts w:ascii="宋体" w:eastAsia="宋体"/>
+                <w:sz w:val="20"/>
+                <w:szCs w:val="20"/>
+              </w:rPr>
+              <w:t>组长（签字）：                          2026年   月   日</w:t>
+            </w:r>
+          </w:p>
+        </w:tc>
+      </w:tr>
+    </w:tbl>
+    <w:p>
+      <w:pPr>
+        <w:jc w:val="center"/>
+        <w:rPr>
+          <w:rFonts w:ascii="Times New Roman"/>
+          <w:b/>
+        </w:rPr>
+      </w:pPr>
+    </w:p>
+    <w:p>
+      <w:pPr>
+        <w:jc w:val="center"/>
+        <w:rPr>
+          <w:rFonts w:ascii="Times New Roman"/>
+          <w:b/>
+        </w:rPr>
+      </w:pPr>
+    </w:p>
+    <w:p>
+      <w:pPr>
+        <w:jc w:val="center"/>
+        <w:rPr>
+          <w:rFonts w:ascii="Times New Roman"/>
+          <w:b/>
+        </w:rPr>
+      </w:pPr>
+    </w:p>
+    <w:p>
+      <w:pPr>
+        <w:jc w:val="center"/>
+        <w:rPr>
+          <w:rFonts w:ascii="Times New Roman"/>
+          <w:b/>
+        </w:rPr>
+      </w:pPr>
+    </w:p>
+    <w:p>
+      <w:pPr>
+        <w:jc w:val="center"/>
+        <w:rPr>
+          <w:rFonts w:ascii="Times New Roman"/>
+          <w:b/>
+        </w:rPr>
+      </w:pPr>
+    </w:p>
+    <w:p>
+      <w:pPr>
+        <w:spacing w:before="240" w:beforeLines="100" w:after="240" w:afterLines="100" w:line="560" w:lineRule="exact"/>
+        <w:jc w:val="center"/>
+        <w:rPr>
+          <w:rFonts w:eastAsia="黑体"/>
+          <w:b/>
+          <w:color w:val="000000"/>
+          <w:sz w:val="36"/>
+          <w:szCs w:val="30"/>
+        </w:rPr>
+      </w:pPr>
+      <w:r>
+        <w:rPr>
+          <w:rFonts w:hint="eastAsia" w:eastAsia="黑体"/>
+          <w:bCs/>
+          <w:color w:val="000000"/>
+          <w:sz w:val="36"/>
+          <w:szCs w:val="30"/>
+        </w:rPr>
+        <w:t>毕业设计（论文）原创性声明</w:t>
+      </w:r>
+    </w:p>
+    <w:p>
+      <w:pPr>
+        <w:pStyle w:val="12"/>
+        <w:spacing w:before="0" w:beforeAutospacing="0" w:after="0" w:afterAutospacing="0" w:line="400" w:lineRule="exact"/>
+        <w:ind w:firstLine="480" w:firstLineChars="200"/>
+        <w:jc w:val="both"/>
+        <w:rPr>
+          <w:rFonts w:hint="eastAsia" w:asciiTheme="minorEastAsia" w:hAnsiTheme="minorEastAsia" w:eastAsiaTheme="minorEastAsia" w:cstheme="minorEastAsia"/>
+          <w:color w:val="000000"/>
+        </w:rPr>
+      </w:pPr>
+      <w:r>
+        <w:rPr>
+          <w:rFonts w:hint="eastAsia" w:asciiTheme="minorEastAsia" w:hAnsiTheme="minorEastAsia" w:eastAsiaTheme="minorEastAsia" w:cstheme="minorEastAsia"/>
+          <w:color w:val="000000"/>
+        </w:rPr>
+        <w:t>本人郑重声明：所呈交的毕业设计（论文），题目为《</w:t>
+      </w:r>
+      <w:r>
+        <w:rPr>
+          <w:rFonts w:hint="eastAsia" w:asciiTheme="minorEastAsia" w:hAnsiTheme="minorEastAsia" w:eastAsiaTheme="minorEastAsia" w:cstheme="minorEastAsia"/>
+          <w:bCs/>
+          <w:color w:val="000000"/>
+        </w:rPr>
+        <w:t>基于 LangGraph 的多 Agent 协作框架在医疗审计场景的设计与实现</w:t>
+      </w:r>
+      <w:r>
+        <w:rPr>
+          <w:rFonts w:hint="eastAsia" w:asciiTheme="minorEastAsia" w:hAnsiTheme="minorEastAsia" w:eastAsiaTheme="minorEastAsia" w:cstheme="minorEastAsia"/>
+          <w:color w:val="000000"/>
+        </w:rPr>
+        <w:t>》，是本人在导师指导下，进行研究工作所取得的成果。尽我所知，除了文中特别加以标注的内容外，本毕业设计（论文）的研究成果不包含任何他人创作的、已公开发表或者没有公开发表的作品的内容。对本毕业设计（论文）所涉及的研究工作做出贡献的其他个人和集体，均已在文中以明确方式标明并表示了谢意。本毕业设计（论文）原创性声明的法律责任由本人承担。</w:t>
+      </w:r>
+    </w:p>
+    <w:p>
+      <w:pPr>
+        <w:spacing w:line="400" w:lineRule="exact"/>
+        <w:ind w:firstLine="480" w:firstLineChars="200"/>
+        <w:rPr>
+          <w:rFonts w:hint="eastAsia" w:asciiTheme="minorEastAsia" w:hAnsiTheme="minorEastAsia" w:eastAsiaTheme="minorEastAsia" w:cstheme="minorEastAsia"/>
+          <w:color w:val="000000"/>
+          <w:szCs w:val="24"/>
+        </w:rPr>
+      </w:pPr>
+      <w:r>
+        <w:rPr>
+          <w:rFonts w:hint="eastAsia" w:asciiTheme="minorEastAsia" w:hAnsiTheme="minorEastAsia" w:eastAsiaTheme="minorEastAsia" w:cstheme="minorEastAsia"/>
+          <w:color w:val="000000"/>
+          <w:szCs w:val="24"/>
+        </w:rPr>
+        <w:t xml:space="preserve">                      </w:t>
+      </w:r>
+    </w:p>
+    <w:p>
+      <w:pPr>
+        <w:spacing w:line="560" w:lineRule="exact"/>
+        <w:ind w:firstLine="3840" w:firstLineChars="1600"/>
+        <w:rPr>
+          <w:rFonts w:hint="eastAsia" w:asciiTheme="minorEastAsia" w:hAnsiTheme="minorEastAsia" w:eastAsiaTheme="minorEastAsia" w:cstheme="minorEastAsia"/>
+          <w:color w:val="000000"/>
+          <w:szCs w:val="24"/>
+        </w:rPr>
+      </w:pPr>
+      <w:r>
+        <w:rPr>
+          <w:rFonts w:hint="eastAsia" w:asciiTheme="minorEastAsia" w:hAnsiTheme="minorEastAsia" w:eastAsiaTheme="minorEastAsia" w:cstheme="minorEastAsia"/>
+          <w:color w:val="000000"/>
+          <w:szCs w:val="24"/>
+        </w:rPr>
+        <w:t xml:space="preserve"> 作者签名：   </w:t>
+      </w:r>
+    </w:p>
+    <w:p>
+      <w:pPr>
+        <w:spacing w:line="560" w:lineRule="exact"/>
+        <w:jc w:val="center"/>
+        <w:rPr>
+          <w:rFonts w:hint="eastAsia" w:asciiTheme="minorEastAsia" w:hAnsiTheme="minorEastAsia" w:eastAsiaTheme="minorEastAsia" w:cstheme="minorEastAsia"/>
+          <w:color w:val="000000"/>
+          <w:szCs w:val="24"/>
+        </w:rPr>
+      </w:pPr>
+      <w:r>
+        <w:rPr>
+          <w:rFonts w:hint="eastAsia" w:asciiTheme="minorEastAsia" w:hAnsiTheme="minorEastAsia" w:eastAsiaTheme="minorEastAsia" w:cstheme="minorEastAsia"/>
+          <w:color w:val="000000"/>
+          <w:szCs w:val="24"/>
+        </w:rPr>
+        <w:t xml:space="preserve">                                       年    月     日</w:t>
+      </w:r>
+    </w:p>
+    <w:p>
+      <w:pPr>
+        <w:spacing w:line="560" w:lineRule="exact"/>
+        <w:jc w:val="center"/>
+        <w:rPr>
+          <w:rFonts w:ascii="Times New Roman"/>
+          <w:b/>
+        </w:rPr>
+      </w:pPr>
+    </w:p>
+    <w:p>
+      <w:pPr>
+        <w:spacing w:line="560" w:lineRule="exact"/>
+        <w:jc w:val="center"/>
+        <w:rPr>
+          <w:rFonts w:ascii="Times New Roman"/>
+          <w:b/>
+        </w:rPr>
+      </w:pPr>
+    </w:p>
+    <w:p>
+      <w:pPr>
+        <w:pageBreakBefore/>
+        <w:spacing w:before="240" w:beforeLines="100" w:after="240" w:afterLines="100" w:line="560" w:lineRule="exact"/>
+        <w:jc w:val="center"/>
+        <w:rPr>
+          <w:rFonts w:eastAsia="黑体"/>
+          <w:bCs/>
+          <w:color w:val="000000"/>
+          <w:sz w:val="36"/>
+          <w:szCs w:val="30"/>
+        </w:rPr>
+      </w:pPr>
+      <w:r>
+        <w:rPr>
+          <w:rFonts w:hint="eastAsia" w:eastAsia="黑体"/>
+          <w:bCs/>
+          <w:color w:val="000000"/>
+          <w:sz w:val="36"/>
+          <w:szCs w:val="30"/>
+        </w:rPr>
+        <w:t>毕业设计（论文）版权授权声明</w:t>
+      </w:r>
+    </w:p>
+    <w:p>
+      <w:pPr>
+        <w:pStyle w:val="12"/>
+        <w:spacing w:before="0" w:beforeAutospacing="0" w:after="0" w:afterAutospacing="0" w:line="400" w:lineRule="exact"/>
+        <w:ind w:firstLine="480" w:firstLineChars="200"/>
+        <w:jc w:val="both"/>
+        <w:rPr>
+          <w:rFonts w:ascii="Times New Roman" w:hAnsi="Times New Roman"/>
+          <w:color w:val="000000"/>
+        </w:rPr>
+      </w:pPr>
+      <w:r>
+        <w:rPr>
+          <w:rFonts w:hint="eastAsia" w:ascii="Times New Roman" w:hAnsi="Times New Roman"/>
+          <w:color w:val="000000"/>
+        </w:rPr>
+        <w:t>本人完全了解北京信息科技大学关于收集、保存、使用本科生毕业设计（论文）的要求，按照学校要求提交毕业设计（论文）的印刷本和电子版本。学校有权保留毕业设计（论文）并向相关机构送交论文的电子版和纸质版，允许论文被查阅和借阅，可以采用影印、缩印或扫描等复制手段保存、汇编毕业设计（论文）。学校有权适当复制、公布论文的全部或部分内容。</w:t>
+      </w:r>
+    </w:p>
+    <w:p>
+      <w:pPr>
+        <w:pStyle w:val="5"/>
+        <w:spacing w:line="560" w:lineRule="exact"/>
+        <w:rPr>
+          <w:color w:val="000000"/>
+          <w:szCs w:val="24"/>
+        </w:rPr>
+      </w:pPr>
+    </w:p>
+    <w:p>
+      <w:pPr>
+        <w:pStyle w:val="5"/>
+        <w:spacing w:line="560" w:lineRule="exact"/>
+        <w:rPr>
+          <w:color w:val="000000"/>
+          <w:szCs w:val="24"/>
+        </w:rPr>
+      </w:pPr>
+    </w:p>
+    <w:tbl>
+      <w:tblPr>
+        <w:tblStyle w:val="14"/>
+        <w:tblW w:w="0" w:type="auto"/>
+        <w:tblInd w:w="0" w:type="dxa"/>
+        <w:tblLayout w:type="autofit"/>
+        <w:tblCellMar>
+          <w:top w:w="0" w:type="dxa"/>
+          <w:left w:w="108" w:type="dxa"/>
+          <w:bottom w:w="0" w:type="dxa"/>
+          <w:right w:w="108" w:type="dxa"/>
+        </w:tblCellMar>
+      </w:tblPr>
+      <w:tblGrid>
+        <w:gridCol w:w="1728"/>
+        <w:gridCol w:w="900"/>
+        <w:gridCol w:w="1620"/>
+        <w:gridCol w:w="1440"/>
+        <w:gridCol w:w="970"/>
+        <w:gridCol w:w="1836"/>
+      </w:tblGrid>
+      <w:tr>
+        <w:tblPrEx>
+          <w:tblCellMar>
+            <w:top w:w="0" w:type="dxa"/>
+            <w:left w:w="108" w:type="dxa"/>
+            <w:bottom w:w="0" w:type="dxa"/>
+            <w:right w:w="108" w:type="dxa"/>
+          </w:tblCellMar>
+        </w:tblPrEx>
+        <w:trPr>
+          <w:trHeight w:val="762" w:hRule="atLeast"/>
+        </w:trPr>
+        <w:tc>
+          <w:tcPr>
+            <w:tcW w:w="2628" w:type="dxa"/>
+            <w:gridSpan w:val="2"/>
+          </w:tcPr>
+          <w:p>
+            <w:pPr>
+              <w:pStyle w:val="12"/>
+              <w:spacing w:before="0" w:beforeAutospacing="0" w:after="0" w:afterAutospacing="0" w:line="400" w:lineRule="exact"/>
+              <w:ind w:firstLine="480" w:firstLineChars="200"/>
+              <w:jc w:val="both"/>
+              <w:rPr>
+                <w:rFonts w:ascii="Times New Roman" w:hAnsi="Times New Roman"/>
+                <w:color w:val="000000"/>
+              </w:rPr>
+            </w:pPr>
+            <w:r>
+              <w:rPr>
+                <w:rFonts w:hint="eastAsia" w:ascii="Times New Roman" w:hAnsi="Times New Roman"/>
+                <w:color w:val="000000"/>
+              </w:rPr>
+              <w:t>指导教师签名：</w:t>
+            </w:r>
+          </w:p>
+        </w:tc>
+        <w:tc>
+          <w:tcPr>
+            <w:tcW w:w="1620" w:type="dxa"/>
+          </w:tcPr>
+          <w:p>
+            <w:pPr>
+              <w:pStyle w:val="12"/>
+              <w:spacing w:before="0" w:beforeAutospacing="0" w:after="0" w:afterAutospacing="0" w:line="400" w:lineRule="exact"/>
+              <w:ind w:firstLine="480" w:firstLineChars="200"/>
+              <w:jc w:val="both"/>
+              <w:rPr>
+                <w:rFonts w:ascii="Times New Roman" w:hAnsi="Times New Roman"/>
+                <w:color w:val="000000"/>
+              </w:rPr>
+            </w:pPr>
+          </w:p>
+        </w:tc>
+        <w:tc>
+          <w:tcPr>
+            <w:tcW w:w="2410" w:type="dxa"/>
+            <w:gridSpan w:val="2"/>
+          </w:tcPr>
+          <w:p>
+            <w:pPr>
+              <w:pStyle w:val="12"/>
+              <w:spacing w:before="0" w:beforeAutospacing="0" w:after="0" w:afterAutospacing="0" w:line="400" w:lineRule="exact"/>
+              <w:ind w:firstLine="480" w:firstLineChars="200"/>
+              <w:jc w:val="both"/>
+              <w:rPr>
+                <w:rFonts w:ascii="Times New Roman" w:hAnsi="Times New Roman"/>
+                <w:color w:val="000000"/>
+              </w:rPr>
+            </w:pPr>
+            <w:r>
+              <w:rPr>
+                <w:rFonts w:hint="eastAsia" w:ascii="Times New Roman" w:hAnsi="Times New Roman"/>
+                <w:color w:val="000000"/>
+              </w:rPr>
+              <w:t>作者签名：</w:t>
+            </w:r>
+          </w:p>
+        </w:tc>
+        <w:tc>
+          <w:tcPr>
+            <w:tcW w:w="1836" w:type="dxa"/>
+          </w:tcPr>
+          <w:p>
+            <w:pPr>
+              <w:pStyle w:val="12"/>
+              <w:spacing w:before="0" w:beforeAutospacing="0" w:after="0" w:afterAutospacing="0" w:line="400" w:lineRule="exact"/>
+              <w:ind w:firstLine="480" w:firstLineChars="200"/>
+              <w:jc w:val="both"/>
+              <w:rPr>
+                <w:rFonts w:ascii="Times New Roman" w:hAnsi="Times New Roman"/>
+                <w:color w:val="000000"/>
+              </w:rPr>
+            </w:pPr>
+          </w:p>
+        </w:tc>
+      </w:tr>
+      <w:tr>
+        <w:tblPrEx>
+          <w:tblCellMar>
+            <w:top w:w="0" w:type="dxa"/>
+            <w:left w:w="108" w:type="dxa"/>
+            <w:bottom w:w="0" w:type="dxa"/>
+            <w:right w:w="108" w:type="dxa"/>
+          </w:tblCellMar>
+        </w:tblPrEx>
+        <w:trPr>
+          <w:trHeight w:val="771" w:hRule="atLeast"/>
+        </w:trPr>
+        <w:tc>
+          <w:tcPr>
+            <w:tcW w:w="1728" w:type="dxa"/>
+          </w:tcPr>
+          <w:p>
+            <w:pPr>
+              <w:pStyle w:val="12"/>
+              <w:spacing w:before="0" w:beforeAutospacing="0" w:after="0" w:afterAutospacing="0" w:line="400" w:lineRule="exact"/>
+              <w:ind w:firstLine="480" w:firstLineChars="200"/>
+              <w:jc w:val="both"/>
+              <w:rPr>
+                <w:rFonts w:ascii="Times New Roman" w:hAnsi="Times New Roman"/>
+                <w:color w:val="000000"/>
+              </w:rPr>
+            </w:pPr>
+          </w:p>
+        </w:tc>
+        <w:tc>
+          <w:tcPr>
+            <w:tcW w:w="2520" w:type="dxa"/>
+            <w:gridSpan w:val="2"/>
+          </w:tcPr>
+          <w:p>
+            <w:pPr>
+              <w:pStyle w:val="12"/>
+              <w:spacing w:before="0" w:beforeAutospacing="0" w:after="0" w:afterAutospacing="0" w:line="400" w:lineRule="exact"/>
+              <w:ind w:firstLine="480" w:firstLineChars="200"/>
+              <w:jc w:val="both"/>
+              <w:rPr>
+                <w:rFonts w:ascii="Times New Roman" w:hAnsi="Times New Roman"/>
+                <w:color w:val="000000"/>
+              </w:rPr>
+            </w:pPr>
+            <w:r>
+              <w:rPr>
+                <w:rFonts w:hint="eastAsia" w:ascii="Times New Roman" w:hAnsi="Times New Roman"/>
+                <w:color w:val="000000"/>
+              </w:rPr>
+              <w:t>年   月   日</w:t>
+            </w:r>
+          </w:p>
+        </w:tc>
+        <w:tc>
+          <w:tcPr>
+            <w:tcW w:w="1440" w:type="dxa"/>
+          </w:tcPr>
+          <w:p>
+            <w:pPr>
+              <w:pStyle w:val="12"/>
+              <w:spacing w:before="0" w:beforeAutospacing="0" w:after="0" w:afterAutospacing="0" w:line="400" w:lineRule="exact"/>
+              <w:ind w:firstLine="480" w:firstLineChars="200"/>
+              <w:jc w:val="both"/>
+              <w:rPr>
+                <w:rFonts w:ascii="Times New Roman" w:hAnsi="Times New Roman"/>
+                <w:color w:val="000000"/>
+              </w:rPr>
+            </w:pPr>
+          </w:p>
+        </w:tc>
+        <w:tc>
+          <w:tcPr>
+            <w:tcW w:w="2806" w:type="dxa"/>
+            <w:gridSpan w:val="2"/>
+          </w:tcPr>
+          <w:p>
+            <w:pPr>
+              <w:pStyle w:val="12"/>
+              <w:spacing w:before="0" w:beforeAutospacing="0" w:after="0" w:afterAutospacing="0" w:line="400" w:lineRule="exact"/>
+              <w:ind w:firstLine="480" w:firstLineChars="200"/>
+              <w:jc w:val="both"/>
+              <w:rPr>
+                <w:rFonts w:ascii="Times New Roman" w:hAnsi="Times New Roman"/>
+                <w:color w:val="000000"/>
+              </w:rPr>
+            </w:pPr>
+            <w:r>
+              <w:rPr>
+                <w:rFonts w:hint="eastAsia" w:ascii="Times New Roman" w:hAnsi="Times New Roman"/>
+                <w:color w:val="000000"/>
+              </w:rPr>
+              <w:t>年    月    日</w:t>
             </w:r>
           </w:p>
         </w:tc>

</xml_diff>